<commit_message>
docs: expand developer and troubleshooting guides to ultra-detail
- Comprehensive architectural deep-dive into MultiProvider and Services
- Detailed Firestore schema and security rule documentation
- Expanded troubleshooting scenarios (Gradle, Provider, Firebase permissions)
- Updated docx generation scripts for professional output
</commit_message>
<xml_diff>
--- a/docs/engineering/client_delivery/14_Developer_Guide_Enterprise.docx
+++ b/docs/engineering/client_delivery/14_Developer_Guide_Enterprise.docx
@@ -319,7 +319,7 @@
           <w:color w:val="444444"/>
           <w:sz w:val="24"/>
         </w:rPr>
-        <w:t>1. Architecture Overview</w:t>
+        <w:t>1. Architecture &amp; philosophy</w:t>
       </w:r>
     </w:p>
     <w:p>
@@ -334,7 +334,7 @@
           <w:color w:val="444444"/>
           <w:sz w:val="24"/>
         </w:rPr>
-        <w:t>2. Project Structure</w:t>
+        <w:t>2. Project Structure Deep-Dive</w:t>
       </w:r>
     </w:p>
     <w:p>
@@ -349,7 +349,7 @@
           <w:color w:val="444444"/>
           <w:sz w:val="24"/>
         </w:rPr>
-        <w:t>3. Environment Setup</w:t>
+        <w:t>3. Infrastucture: Firebase &amp; Secure Storage</w:t>
       </w:r>
     </w:p>
     <w:p>
@@ -364,7 +364,7 @@
           <w:color w:val="444444"/>
           <w:sz w:val="24"/>
         </w:rPr>
-        <w:t>4. Dependency Management</w:t>
+        <w:t>4. State Management (Provider Stack)</w:t>
       </w:r>
     </w:p>
     <w:p>
@@ -379,7 +379,7 @@
           <w:color w:val="444444"/>
           <w:sz w:val="24"/>
         </w:rPr>
-        <w:t>5. Coding Standards</w:t>
+        <w:t>5. Administrative Staging Workflow</w:t>
       </w:r>
     </w:p>
     <w:p>
@@ -394,7 +394,7 @@
           <w:color w:val="444444"/>
           <w:sz w:val="24"/>
         </w:rPr>
-        <w:t>6. State Management</w:t>
+        <w:t>6. Security Architecture &amp; VAPT Mitigation</w:t>
       </w:r>
     </w:p>
     <w:p>
@@ -409,7 +409,7 @@
           <w:color w:val="444444"/>
           <w:sz w:val="24"/>
         </w:rPr>
-        <w:t>7. Firebase &amp; Data Layer</w:t>
+        <w:t>7. Build &amp; Environment Configuration</w:t>
       </w:r>
     </w:p>
     <w:p>
@@ -424,37 +424,7 @@
           <w:color w:val="444444"/>
           <w:sz w:val="24"/>
         </w:rPr>
-        <w:t>8. Security Practices</w:t>
-      </w:r>
-    </w:p>
-    <w:p>
-      <w:pPr>
-        <w:spacing w:after="60"/>
-      </w:pPr>
-      <w:r>
-        <w:rPr>
-          <w:rFonts w:ascii="Aptos" w:hAnsi="Aptos" w:cs="Aptos" w:eastAsia="Aptos"/>
-          <w:b w:val="0"/>
-          <w:i w:val="0"/>
-          <w:color w:val="444444"/>
-          <w:sz w:val="24"/>
-        </w:rPr>
-        <w:t>9. Build &amp; Deployment</w:t>
-      </w:r>
-    </w:p>
-    <w:p>
-      <w:pPr>
-        <w:spacing w:after="60"/>
-      </w:pPr>
-      <w:r>
-        <w:rPr>
-          <w:rFonts w:ascii="Aptos" w:hAnsi="Aptos" w:cs="Aptos" w:eastAsia="Aptos"/>
-          <w:b w:val="0"/>
-          <w:i w:val="0"/>
-          <w:color w:val="444444"/>
-          <w:sz w:val="24"/>
-        </w:rPr>
-        <w:t>10. Testing Workflow</w:t>
+        <w:t>8. Developer Workflow &amp; Standards</w:t>
       </w:r>
     </w:p>
     <w:p>
@@ -474,7 +444,7 @@
           <w:color w:val="1A1A2E"/>
           <w:sz w:val="40"/>
         </w:rPr>
-        <w:t>1. Architecture Overview</w:t>
+        <w:t>1. Architecture &amp; Philosophy</w:t>
       </w:r>
     </w:p>
     <w:p>
@@ -499,7 +469,22 @@
           <w:color w:val="444444"/>
           <w:sz w:val="24"/>
         </w:rPr>
-        <w:t>Vishal Gold is an enterprise-grade B2B/B2C jewelry mobile application built on the Flutter framework with a multi-layered Firebase backend. The system is designed for high availability, secure PII handling, and scalability across large jewelry inventories.</w:t>
+        <w:t>The Vishal Gold application is built on a high-availability, security-first foundation. The system follows a reactive architecture where the UI is a function of the state, and the state is strictly managed through localized providers.</w:t>
+      </w:r>
+    </w:p>
+    <w:p>
+      <w:pPr>
+        <w:spacing w:before="280" w:after="60"/>
+      </w:pPr>
+      <w:r>
+        <w:rPr>
+          <w:rFonts w:ascii="Aptos" w:hAnsi="Aptos" w:cs="Aptos" w:eastAsia="Aptos"/>
+          <w:b/>
+          <w:i w:val="0"/>
+          <w:color w:val="1A1A2E"/>
+          <w:sz w:val="30"/>
+        </w:rPr>
+        <w:t>1.1 Reactive Data Flow</w:t>
       </w:r>
     </w:p>
     <w:p>
@@ -516,7 +501,7 @@
           <w:color w:val="444444"/>
           <w:sz w:val="24"/>
         </w:rPr>
-        <w:t>The application follows a clean-architecture inspired approach with strict separation between UI, state management, and the service layer. The diagram below illustrates the primary data flow and relationship between components.</w:t>
+        <w:t>We utilize the 'Provider' package for state management. This ensures a clean separation between business logic and user interface. Every major domain (Auth, Cart, Products) lives in its own ChangeNotifier singleton.</w:t>
       </w:r>
     </w:p>
     <w:p>
@@ -533,7 +518,7 @@
           <w:color w:val="444444"/>
           <w:sz w:val="24"/>
         </w:rPr>
-        <w:t>UI Layer: Flutter Widgets observing state via Provider.</w:t>
+        <w:t>Unidirectional Data Flow: UI -&gt; Provider Action -&gt; Service -&gt; Firestore.</w:t>
       </w:r>
     </w:p>
     <w:p>
@@ -550,7 +535,7 @@
           <w:color w:val="444444"/>
           <w:sz w:val="24"/>
         </w:rPr>
-        <w:t>State Layer: Providers (ChangeNotifier) managing business logic and reactive updates.</w:t>
+        <w:t>State Persistence: Critical PII is persisted in Secure Storage; catalog data in Firestore.</w:t>
       </w:r>
     </w:p>
     <w:p>
@@ -567,364 +552,9 @@
           <w:color w:val="444444"/>
           <w:sz w:val="24"/>
         </w:rPr>
-        <w:t>Service Layer: Core logic for Firebase (Auth, Firestore, Storage) and Local Storage (SharedPreferences, SecureStorage).</w:t>
+        <w:t>Lazy Initialization: Providers are instantiated only when needed by the widget tree.</w:t>
       </w:r>
     </w:p>
-    <w:p>
-      <w:pPr>
-        <w:pStyle w:val="ListBullet"/>
-        <w:spacing w:after="80"/>
-        <w:ind w:left="432"/>
-      </w:pPr>
-      <w:r>
-        <w:rPr>
-          <w:rFonts w:ascii="Aptos" w:hAnsi="Aptos" w:cs="Aptos" w:eastAsia="Aptos"/>
-          <w:b w:val="0"/>
-          <w:i w:val="0"/>
-          <w:color w:val="444444"/>
-          <w:sz w:val="24"/>
-        </w:rPr>
-        <w:t>Backend: Firebase infrastructure (managed services).</w:t>
-      </w:r>
-    </w:p>
-    <w:p>
-      <w:pPr>
-        <w:spacing w:before="280" w:after="60"/>
-      </w:pPr>
-      <w:r>
-        <w:rPr>
-          <w:rFonts w:ascii="Aptos" w:hAnsi="Aptos" w:cs="Aptos" w:eastAsia="Aptos"/>
-          <w:b/>
-          <w:i w:val="0"/>
-          <w:color w:val="1A1A2E"/>
-          <w:sz w:val="30"/>
-        </w:rPr>
-        <w:t>1.1 User Roles &amp; Access Control</w:t>
-      </w:r>
-    </w:p>
-    <w:tbl>
-      <w:tblPr>
-        <w:tblStyle w:val="TableGrid"/>
-        <w:tblW w:type="auto" w:w="0"/>
-        <w:jc w:val="center"/>
-        <w:tblLook w:firstColumn="1" w:firstRow="1" w:lastColumn="0" w:lastRow="0" w:noHBand="0" w:noVBand="1" w:val="04A0"/>
-      </w:tblPr>
-      <w:tblGrid>
-        <w:gridCol w:w="2280"/>
-        <w:gridCol w:w="2280"/>
-        <w:gridCol w:w="2280"/>
-        <w:gridCol w:w="2280"/>
-      </w:tblGrid>
-      <w:tr>
-        <w:tc>
-          <w:tcPr>
-            <w:tcW w:type="dxa" w:w="2280"/>
-            <w:shd w:val="clear" w:color="auto" w:fill="1A1A2E"/>
-          </w:tcPr>
-          <w:p>
-            <w:pPr>
-              <w:jc w:val="center"/>
-            </w:pPr>
-            <w:r>
-              <w:rPr>
-                <w:rFonts w:ascii="Aptos" w:hAnsi="Aptos" w:cs="Aptos" w:eastAsia="Aptos"/>
-                <w:b/>
-                <w:i w:val="0"/>
-                <w:color w:val="FFFFFF"/>
-                <w:sz w:val="22"/>
-              </w:rPr>
-              <w:t>Role</w:t>
-            </w:r>
-          </w:p>
-        </w:tc>
-        <w:tc>
-          <w:tcPr>
-            <w:tcW w:type="dxa" w:w="2280"/>
-            <w:shd w:val="clear" w:color="auto" w:fill="1A1A2E"/>
-          </w:tcPr>
-          <w:p>
-            <w:pPr>
-              <w:jc w:val="center"/>
-            </w:pPr>
-            <w:r>
-              <w:rPr>
-                <w:rFonts w:ascii="Aptos" w:hAnsi="Aptos" w:cs="Aptos" w:eastAsia="Aptos"/>
-                <w:b/>
-                <w:i w:val="0"/>
-                <w:color w:val="FFFFFF"/>
-                <w:sz w:val="22"/>
-              </w:rPr>
-              <w:t>Auth Type</w:t>
-            </w:r>
-          </w:p>
-        </w:tc>
-        <w:tc>
-          <w:tcPr>
-            <w:tcW w:type="dxa" w:w="2280"/>
-            <w:shd w:val="clear" w:color="auto" w:fill="1A1A2E"/>
-          </w:tcPr>
-          <w:p>
-            <w:pPr>
-              <w:jc w:val="center"/>
-            </w:pPr>
-            <w:r>
-              <w:rPr>
-                <w:rFonts w:ascii="Aptos" w:hAnsi="Aptos" w:cs="Aptos" w:eastAsia="Aptos"/>
-                <w:b/>
-                <w:i w:val="0"/>
-                <w:color w:val="FFFFFF"/>
-                <w:sz w:val="22"/>
-              </w:rPr>
-              <w:t>Storage</w:t>
-            </w:r>
-          </w:p>
-        </w:tc>
-        <w:tc>
-          <w:tcPr>
-            <w:tcW w:type="dxa" w:w="2280"/>
-            <w:shd w:val="clear" w:color="auto" w:fill="1A1A2E"/>
-          </w:tcPr>
-          <w:p>
-            <w:pPr>
-              <w:jc w:val="center"/>
-            </w:pPr>
-            <w:r>
-              <w:rPr>
-                <w:rFonts w:ascii="Aptos" w:hAnsi="Aptos" w:cs="Aptos" w:eastAsia="Aptos"/>
-                <w:b/>
-                <w:i w:val="0"/>
-                <w:color w:val="FFFFFF"/>
-                <w:sz w:val="22"/>
-              </w:rPr>
-              <w:t>Description</w:t>
-            </w:r>
-          </w:p>
-        </w:tc>
-      </w:tr>
-      <w:tr>
-        <w:tc>
-          <w:tcPr>
-            <w:tcW w:type="dxa" w:w="2280"/>
-            <w:shd w:val="clear" w:color="auto" w:fill="F5F5F5"/>
-          </w:tcPr>
-          <w:p>
-            <w:r>
-              <w:rPr>
-                <w:rFonts w:ascii="Aptos" w:hAnsi="Aptos" w:cs="Aptos" w:eastAsia="Aptos"/>
-                <w:b w:val="0"/>
-                <w:i w:val="0"/>
-                <w:color w:val="444444"/>
-                <w:sz w:val="20"/>
-              </w:rPr>
-              <w:t>Wholesaler</w:t>
-            </w:r>
-          </w:p>
-        </w:tc>
-        <w:tc>
-          <w:tcPr>
-            <w:tcW w:type="dxa" w:w="2280"/>
-            <w:shd w:val="clear" w:color="auto" w:fill="F5F5F5"/>
-          </w:tcPr>
-          <w:p>
-            <w:r>
-              <w:rPr>
-                <w:rFonts w:ascii="Aptos" w:hAnsi="Aptos" w:cs="Aptos" w:eastAsia="Aptos"/>
-                <w:b w:val="0"/>
-                <w:i w:val="0"/>
-                <w:color w:val="444444"/>
-                <w:sz w:val="20"/>
-              </w:rPr>
-              <w:t>Phone OTP</w:t>
-            </w:r>
-          </w:p>
-        </w:tc>
-        <w:tc>
-          <w:tcPr>
-            <w:tcW w:type="dxa" w:w="2280"/>
-            <w:shd w:val="clear" w:color="auto" w:fill="F5F5F5"/>
-          </w:tcPr>
-          <w:p>
-            <w:r>
-              <w:rPr>
-                <w:rFonts w:ascii="Aptos" w:hAnsi="Aptos" w:cs="Aptos" w:eastAsia="Aptos"/>
-                <w:b w:val="0"/>
-                <w:i w:val="0"/>
-                <w:color w:val="444444"/>
-                <w:sz w:val="20"/>
-              </w:rPr>
-              <w:t>Firestore</w:t>
-            </w:r>
-          </w:p>
-        </w:tc>
-        <w:tc>
-          <w:tcPr>
-            <w:tcW w:type="dxa" w:w="2280"/>
-            <w:shd w:val="clear" w:color="auto" w:fill="F5F5F5"/>
-          </w:tcPr>
-          <w:p>
-            <w:r>
-              <w:rPr>
-                <w:rFonts w:ascii="Aptos" w:hAnsi="Aptos" w:cs="Aptos" w:eastAsia="Aptos"/>
-                <w:b w:val="0"/>
-                <w:i w:val="0"/>
-                <w:color w:val="444444"/>
-                <w:sz w:val="20"/>
-              </w:rPr>
-              <w:t>Full catalog access, persistent sync.</w:t>
-            </w:r>
-          </w:p>
-        </w:tc>
-      </w:tr>
-      <w:tr>
-        <w:tc>
-          <w:tcPr>
-            <w:tcW w:type="dxa" w:w="2280"/>
-            <w:shd w:val="clear" w:color="auto" w:fill="FFFFFF"/>
-          </w:tcPr>
-          <w:p>
-            <w:r>
-              <w:rPr>
-                <w:rFonts w:ascii="Aptos" w:hAnsi="Aptos" w:cs="Aptos" w:eastAsia="Aptos"/>
-                <w:b w:val="0"/>
-                <w:i w:val="0"/>
-                <w:color w:val="444444"/>
-                <w:sz w:val="20"/>
-              </w:rPr>
-              <w:t>Retailer</w:t>
-            </w:r>
-          </w:p>
-        </w:tc>
-        <w:tc>
-          <w:tcPr>
-            <w:tcW w:type="dxa" w:w="2280"/>
-            <w:shd w:val="clear" w:color="auto" w:fill="FFFFFF"/>
-          </w:tcPr>
-          <w:p>
-            <w:r>
-              <w:rPr>
-                <w:rFonts w:ascii="Aptos" w:hAnsi="Aptos" w:cs="Aptos" w:eastAsia="Aptos"/>
-                <w:b w:val="0"/>
-                <w:i w:val="0"/>
-                <w:color w:val="444444"/>
-                <w:sz w:val="20"/>
-              </w:rPr>
-              <w:t>Phone / Anon</w:t>
-            </w:r>
-          </w:p>
-        </w:tc>
-        <w:tc>
-          <w:tcPr>
-            <w:tcW w:type="dxa" w:w="2280"/>
-            <w:shd w:val="clear" w:color="auto" w:fill="FFFFFF"/>
-          </w:tcPr>
-          <w:p>
-            <w:r>
-              <w:rPr>
-                <w:rFonts w:ascii="Aptos" w:hAnsi="Aptos" w:cs="Aptos" w:eastAsia="Aptos"/>
-                <w:b w:val="0"/>
-                <w:i w:val="0"/>
-                <w:color w:val="444444"/>
-                <w:sz w:val="20"/>
-              </w:rPr>
-              <w:t>LocalStorage</w:t>
-            </w:r>
-          </w:p>
-        </w:tc>
-        <w:tc>
-          <w:tcPr>
-            <w:tcW w:type="dxa" w:w="2280"/>
-            <w:shd w:val="clear" w:color="auto" w:fill="FFFFFF"/>
-          </w:tcPr>
-          <w:p>
-            <w:r>
-              <w:rPr>
-                <w:rFonts w:ascii="Aptos" w:hAnsi="Aptos" w:cs="Aptos" w:eastAsia="Aptos"/>
-                <w:b w:val="0"/>
-                <w:i w:val="0"/>
-                <w:color w:val="444444"/>
-                <w:sz w:val="20"/>
-              </w:rPr>
-              <w:t>Browsing focused, local cart persistence.</w:t>
-            </w:r>
-          </w:p>
-        </w:tc>
-      </w:tr>
-      <w:tr>
-        <w:tc>
-          <w:tcPr>
-            <w:tcW w:type="dxa" w:w="2280"/>
-            <w:shd w:val="clear" w:color="auto" w:fill="F5F5F5"/>
-          </w:tcPr>
-          <w:p>
-            <w:r>
-              <w:rPr>
-                <w:rFonts w:ascii="Aptos" w:hAnsi="Aptos" w:cs="Aptos" w:eastAsia="Aptos"/>
-                <w:b w:val="0"/>
-                <w:i w:val="0"/>
-                <w:color w:val="444444"/>
-                <w:sz w:val="20"/>
-              </w:rPr>
-              <w:t>Admin</w:t>
-            </w:r>
-          </w:p>
-        </w:tc>
-        <w:tc>
-          <w:tcPr>
-            <w:tcW w:type="dxa" w:w="2280"/>
-            <w:shd w:val="clear" w:color="auto" w:fill="F5F5F5"/>
-          </w:tcPr>
-          <w:p>
-            <w:r>
-              <w:rPr>
-                <w:rFonts w:ascii="Aptos" w:hAnsi="Aptos" w:cs="Aptos" w:eastAsia="Aptos"/>
-                <w:b w:val="0"/>
-                <w:i w:val="0"/>
-                <w:color w:val="444444"/>
-                <w:sz w:val="20"/>
-              </w:rPr>
-              <w:t>Credentials</w:t>
-            </w:r>
-          </w:p>
-        </w:tc>
-        <w:tc>
-          <w:tcPr>
-            <w:tcW w:type="dxa" w:w="2280"/>
-            <w:shd w:val="clear" w:color="auto" w:fill="F5F5F5"/>
-          </w:tcPr>
-          <w:p>
-            <w:r>
-              <w:rPr>
-                <w:rFonts w:ascii="Aptos" w:hAnsi="Aptos" w:cs="Aptos" w:eastAsia="Aptos"/>
-                <w:b w:val="0"/>
-                <w:i w:val="0"/>
-                <w:color w:val="444444"/>
-                <w:sz w:val="20"/>
-              </w:rPr>
-              <w:t>Firestore</w:t>
-            </w:r>
-          </w:p>
-        </w:tc>
-        <w:tc>
-          <w:tcPr>
-            <w:tcW w:type="dxa" w:w="2280"/>
-            <w:shd w:val="clear" w:color="auto" w:fill="F5F5F5"/>
-          </w:tcPr>
-          <w:p>
-            <w:r>
-              <w:rPr>
-                <w:rFonts w:ascii="Aptos" w:hAnsi="Aptos" w:cs="Aptos" w:eastAsia="Aptos"/>
-                <w:b w:val="0"/>
-                <w:i w:val="0"/>
-                <w:color w:val="444444"/>
-                <w:sz w:val="20"/>
-              </w:rPr>
-              <w:t>CMS, order mgmt, and staging preview.</w:t>
-            </w:r>
-          </w:p>
-        </w:tc>
-      </w:tr>
-    </w:tbl>
-    <w:p/>
     <w:p>
       <w:pPr>
         <w:spacing w:before="360" w:after="80"/>
@@ -937,7 +567,7 @@
           <w:color w:val="1A1A2E"/>
           <w:sz w:val="40"/>
         </w:rPr>
-        <w:t>2. Project Structure</w:t>
+        <w:t>2. Project Structure Deep-Dive</w:t>
       </w:r>
     </w:p>
     <w:p>
@@ -962,14 +592,360 @@
           <w:color w:val="444444"/>
           <w:sz w:val="24"/>
         </w:rPr>
-        <w:t>The repository follows a standard Flutter structure with clear domain-based separation in the lib/ folder.</w:t>
+        <w:t>The codebase is organized into atomic domains located in the lib/ folder.</w:t>
+      </w:r>
+    </w:p>
+    <w:tbl>
+      <w:tblPr>
+        <w:tblStyle w:val="TableGrid"/>
+        <w:tblW w:type="auto" w:w="0"/>
+        <w:jc w:val="center"/>
+        <w:tblLook w:firstColumn="1" w:firstRow="1" w:lastColumn="0" w:lastRow="0" w:noHBand="0" w:noVBand="1" w:val="04A0"/>
+      </w:tblPr>
+      <w:tblGrid>
+        <w:gridCol w:w="4561"/>
+        <w:gridCol w:w="4561"/>
+      </w:tblGrid>
+      <w:tr>
+        <w:tc>
+          <w:tcPr>
+            <w:tcW w:type="dxa" w:w="4561"/>
+            <w:shd w:val="clear" w:color="auto" w:fill="1A1A2E"/>
+          </w:tcPr>
+          <w:p>
+            <w:pPr>
+              <w:jc w:val="center"/>
+            </w:pPr>
+            <w:r>
+              <w:rPr>
+                <w:rFonts w:ascii="Aptos" w:hAnsi="Aptos" w:cs="Aptos" w:eastAsia="Aptos"/>
+                <w:b/>
+                <w:i w:val="0"/>
+                <w:color w:val="FFFFFF"/>
+                <w:sz w:val="22"/>
+              </w:rPr>
+              <w:t>Directory</w:t>
+            </w:r>
+          </w:p>
+        </w:tc>
+        <w:tc>
+          <w:tcPr>
+            <w:tcW w:type="dxa" w:w="4561"/>
+            <w:shd w:val="clear" w:color="auto" w:fill="1A1A2E"/>
+          </w:tcPr>
+          <w:p>
+            <w:pPr>
+              <w:jc w:val="center"/>
+            </w:pPr>
+            <w:r>
+              <w:rPr>
+                <w:rFonts w:ascii="Aptos" w:hAnsi="Aptos" w:cs="Aptos" w:eastAsia="Aptos"/>
+                <w:b/>
+                <w:i w:val="0"/>
+                <w:color w:val="FFFFFF"/>
+                <w:sz w:val="22"/>
+              </w:rPr>
+              <w:t>Responsibility</w:t>
+            </w:r>
+          </w:p>
+        </w:tc>
+      </w:tr>
+      <w:tr>
+        <w:tc>
+          <w:tcPr>
+            <w:tcW w:type="dxa" w:w="4561"/>
+            <w:shd w:val="clear" w:color="auto" w:fill="F5F5F5"/>
+          </w:tcPr>
+          <w:p>
+            <w:r>
+              <w:rPr>
+                <w:rFonts w:ascii="Aptos" w:hAnsi="Aptos" w:cs="Aptos" w:eastAsia="Aptos"/>
+                <w:b w:val="0"/>
+                <w:i w:val="0"/>
+                <w:color w:val="444444"/>
+                <w:sz w:val="20"/>
+              </w:rPr>
+              <w:t>config/</w:t>
+            </w:r>
+          </w:p>
+        </w:tc>
+        <w:tc>
+          <w:tcPr>
+            <w:tcW w:type="dxa" w:w="4561"/>
+            <w:shd w:val="clear" w:color="auto" w:fill="F5F5F5"/>
+          </w:tcPr>
+          <w:p>
+            <w:r>
+              <w:rPr>
+                <w:rFonts w:ascii="Aptos" w:hAnsi="Aptos" w:cs="Aptos" w:eastAsia="Aptos"/>
+                <w:b w:val="0"/>
+                <w:i w:val="0"/>
+                <w:color w:val="444444"/>
+                <w:sz w:val="20"/>
+              </w:rPr>
+              <w:t>Firebase options and platform-specific configurations.</w:t>
+            </w:r>
+          </w:p>
+        </w:tc>
+      </w:tr>
+      <w:tr>
+        <w:tc>
+          <w:tcPr>
+            <w:tcW w:type="dxa" w:w="4561"/>
+            <w:shd w:val="clear" w:color="auto" w:fill="FFFFFF"/>
+          </w:tcPr>
+          <w:p>
+            <w:r>
+              <w:rPr>
+                <w:rFonts w:ascii="Aptos" w:hAnsi="Aptos" w:cs="Aptos" w:eastAsia="Aptos"/>
+                <w:b w:val="0"/>
+                <w:i w:val="0"/>
+                <w:color w:val="444444"/>
+                <w:sz w:val="20"/>
+              </w:rPr>
+              <w:t>constants/</w:t>
+            </w:r>
+          </w:p>
+        </w:tc>
+        <w:tc>
+          <w:tcPr>
+            <w:tcW w:type="dxa" w:w="4561"/>
+            <w:shd w:val="clear" w:color="auto" w:fill="FFFFFF"/>
+          </w:tcPr>
+          <w:p>
+            <w:r>
+              <w:rPr>
+                <w:rFonts w:ascii="Aptos" w:hAnsi="Aptos" w:cs="Aptos" w:eastAsia="Aptos"/>
+                <w:b w:val="0"/>
+                <w:i w:val="0"/>
+                <w:color w:val="444444"/>
+                <w:sz w:val="20"/>
+              </w:rPr>
+              <w:t>Design tokens (colors, text styles, spacing) and API strings.</w:t>
+            </w:r>
+          </w:p>
+        </w:tc>
+      </w:tr>
+      <w:tr>
+        <w:tc>
+          <w:tcPr>
+            <w:tcW w:type="dxa" w:w="4561"/>
+            <w:shd w:val="clear" w:color="auto" w:fill="F5F5F5"/>
+          </w:tcPr>
+          <w:p>
+            <w:r>
+              <w:rPr>
+                <w:rFonts w:ascii="Aptos" w:hAnsi="Aptos" w:cs="Aptos" w:eastAsia="Aptos"/>
+                <w:b w:val="0"/>
+                <w:i w:val="0"/>
+                <w:color w:val="444444"/>
+                <w:sz w:val="20"/>
+              </w:rPr>
+              <w:t>models/</w:t>
+            </w:r>
+          </w:p>
+        </w:tc>
+        <w:tc>
+          <w:tcPr>
+            <w:tcW w:type="dxa" w:w="4561"/>
+            <w:shd w:val="clear" w:color="auto" w:fill="F5F5F5"/>
+          </w:tcPr>
+          <w:p>
+            <w:r>
+              <w:rPr>
+                <w:rFonts w:ascii="Aptos" w:hAnsi="Aptos" w:cs="Aptos" w:eastAsia="Aptos"/>
+                <w:b w:val="0"/>
+                <w:i w:val="0"/>
+                <w:color w:val="444444"/>
+                <w:sz w:val="20"/>
+              </w:rPr>
+              <w:t>Strongly typed schemas with JSON serialization (Product, User, Order).</w:t>
+            </w:r>
+          </w:p>
+        </w:tc>
+      </w:tr>
+      <w:tr>
+        <w:tc>
+          <w:tcPr>
+            <w:tcW w:type="dxa" w:w="4561"/>
+            <w:shd w:val="clear" w:color="auto" w:fill="FFFFFF"/>
+          </w:tcPr>
+          <w:p>
+            <w:r>
+              <w:rPr>
+                <w:rFonts w:ascii="Aptos" w:hAnsi="Aptos" w:cs="Aptos" w:eastAsia="Aptos"/>
+                <w:b w:val="0"/>
+                <w:i w:val="0"/>
+                <w:color w:val="444444"/>
+                <w:sz w:val="20"/>
+              </w:rPr>
+              <w:t>providers/</w:t>
+            </w:r>
+          </w:p>
+        </w:tc>
+        <w:tc>
+          <w:tcPr>
+            <w:tcW w:type="dxa" w:w="4561"/>
+            <w:shd w:val="clear" w:color="auto" w:fill="FFFFFF"/>
+          </w:tcPr>
+          <w:p>
+            <w:r>
+              <w:rPr>
+                <w:rFonts w:ascii="Aptos" w:hAnsi="Aptos" w:cs="Aptos" w:eastAsia="Aptos"/>
+                <w:b w:val="0"/>
+                <w:i w:val="0"/>
+                <w:color w:val="444444"/>
+                <w:sz w:val="20"/>
+              </w:rPr>
+              <w:t>Business logic containers managing reactive state updates.</w:t>
+            </w:r>
+          </w:p>
+        </w:tc>
+      </w:tr>
+      <w:tr>
+        <w:tc>
+          <w:tcPr>
+            <w:tcW w:type="dxa" w:w="4561"/>
+            <w:shd w:val="clear" w:color="auto" w:fill="F5F5F5"/>
+          </w:tcPr>
+          <w:p>
+            <w:r>
+              <w:rPr>
+                <w:rFonts w:ascii="Aptos" w:hAnsi="Aptos" w:cs="Aptos" w:eastAsia="Aptos"/>
+                <w:b w:val="0"/>
+                <w:i w:val="0"/>
+                <w:color w:val="444444"/>
+                <w:sz w:val="20"/>
+              </w:rPr>
+              <w:t>services/</w:t>
+            </w:r>
+          </w:p>
+        </w:tc>
+        <w:tc>
+          <w:tcPr>
+            <w:tcW w:type="dxa" w:w="4561"/>
+            <w:shd w:val="clear" w:color="auto" w:fill="F5F5F5"/>
+          </w:tcPr>
+          <w:p>
+            <w:r>
+              <w:rPr>
+                <w:rFonts w:ascii="Aptos" w:hAnsi="Aptos" w:cs="Aptos" w:eastAsia="Aptos"/>
+                <w:b w:val="0"/>
+                <w:i w:val="0"/>
+                <w:color w:val="444444"/>
+                <w:sz w:val="20"/>
+              </w:rPr>
+              <w:t>Hardware/Backend interaction layer (Firebase, LocalStorage, Analytics).</w:t>
+            </w:r>
+          </w:p>
+        </w:tc>
+      </w:tr>
+      <w:tr>
+        <w:tc>
+          <w:tcPr>
+            <w:tcW w:type="dxa" w:w="4561"/>
+            <w:shd w:val="clear" w:color="auto" w:fill="FFFFFF"/>
+          </w:tcPr>
+          <w:p>
+            <w:r>
+              <w:rPr>
+                <w:rFonts w:ascii="Aptos" w:hAnsi="Aptos" w:cs="Aptos" w:eastAsia="Aptos"/>
+                <w:b w:val="0"/>
+                <w:i w:val="0"/>
+                <w:color w:val="444444"/>
+                <w:sz w:val="20"/>
+              </w:rPr>
+              <w:t>screens/</w:t>
+            </w:r>
+          </w:p>
+        </w:tc>
+        <w:tc>
+          <w:tcPr>
+            <w:tcW w:type="dxa" w:w="4561"/>
+            <w:shd w:val="clear" w:color="auto" w:fill="FFFFFF"/>
+          </w:tcPr>
+          <w:p>
+            <w:r>
+              <w:rPr>
+                <w:rFonts w:ascii="Aptos" w:hAnsi="Aptos" w:cs="Aptos" w:eastAsia="Aptos"/>
+                <w:b w:val="0"/>
+                <w:i w:val="0"/>
+                <w:color w:val="444444"/>
+                <w:sz w:val="20"/>
+              </w:rPr>
+              <w:t>Feature-specific UI modules (Admin, Wholesaler, Retailer flows).</w:t>
+            </w:r>
+          </w:p>
+        </w:tc>
+      </w:tr>
+      <w:tr>
+        <w:tc>
+          <w:tcPr>
+            <w:tcW w:type="dxa" w:w="4561"/>
+            <w:shd w:val="clear" w:color="auto" w:fill="F5F5F5"/>
+          </w:tcPr>
+          <w:p>
+            <w:r>
+              <w:rPr>
+                <w:rFonts w:ascii="Aptos" w:hAnsi="Aptos" w:cs="Aptos" w:eastAsia="Aptos"/>
+                <w:b w:val="0"/>
+                <w:i w:val="0"/>
+                <w:color w:val="444444"/>
+                <w:sz w:val="20"/>
+              </w:rPr>
+              <w:t>widgets/</w:t>
+            </w:r>
+          </w:p>
+        </w:tc>
+        <w:tc>
+          <w:tcPr>
+            <w:tcW w:type="dxa" w:w="4561"/>
+            <w:shd w:val="clear" w:color="auto" w:fill="F5F5F5"/>
+          </w:tcPr>
+          <w:p>
+            <w:r>
+              <w:rPr>
+                <w:rFonts w:ascii="Aptos" w:hAnsi="Aptos" w:cs="Aptos" w:eastAsia="Aptos"/>
+                <w:b w:val="0"/>
+                <w:i w:val="0"/>
+                <w:color w:val="444444"/>
+                <w:sz w:val="20"/>
+              </w:rPr>
+              <w:t>Re-usable design components (AppButtons, CustomCards, Shimmers).</w:t>
+            </w:r>
+          </w:p>
+        </w:tc>
+      </w:tr>
+    </w:tbl>
+    <w:p/>
+    <w:p>
+      <w:pPr>
+        <w:spacing w:before="360" w:after="80"/>
+      </w:pPr>
+      <w:r>
+        <w:rPr>
+          <w:rFonts w:ascii="Aptos" w:hAnsi="Aptos" w:cs="Aptos" w:eastAsia="Aptos"/>
+          <w:b/>
+          <w:i w:val="0"/>
+          <w:color w:val="1A1A2E"/>
+          <w:sz w:val="40"/>
+        </w:rPr>
+        <w:t>3. Infrastructure: Firebase &amp; Secure Storage</w:t>
       </w:r>
     </w:p>
     <w:p>
       <w:pPr>
-        <w:pStyle w:val="ListBullet"/>
-        <w:spacing w:after="80"/>
-        <w:ind w:left="432"/>
+        <w:spacing w:before="40" w:after="40"/>
+        <w:pBdr>
+          <w:bottom w:val="single" w:sz="8" w:space="1" w:color="D4AF37"/>
+        </w:pBdr>
+      </w:pPr>
+    </w:p>
+    <w:p>
+      <w:pPr>
+        <w:spacing w:after="160"/>
+        <w:ind w:firstLine="0"/>
+        <w:jc w:val="both"/>
       </w:pPr>
       <w:r>
         <w:rPr>
@@ -979,14 +955,29 @@
           <w:color w:val="444444"/>
           <w:sz w:val="24"/>
         </w:rPr>
-        <w:t>lib/main.dart: Entry point; contains MultiProvider setup and app-wide initialization.</w:t>
+        <w:t>The backend is powered by Firebase, with a security layer implemented through hardware-backed storage.</w:t>
       </w:r>
     </w:p>
     <w:p>
       <w:pPr>
-        <w:pStyle w:val="ListBullet"/>
-        <w:spacing w:after="80"/>
-        <w:ind w:left="432"/>
+        <w:spacing w:before="280" w:after="60"/>
+      </w:pPr>
+      <w:r>
+        <w:rPr>
+          <w:rFonts w:ascii="Aptos" w:hAnsi="Aptos" w:cs="Aptos" w:eastAsia="Aptos"/>
+          <w:b/>
+          <w:i w:val="0"/>
+          <w:color w:val="1A1A2E"/>
+          <w:sz w:val="30"/>
+        </w:rPr>
+        <w:t>3.1 FirebaseService</w:t>
+      </w:r>
+    </w:p>
+    <w:p>
+      <w:pPr>
+        <w:spacing w:after="160"/>
+        <w:ind w:firstLine="0"/>
+        <w:jc w:val="both"/>
       </w:pPr>
       <w:r>
         <w:rPr>
@@ -996,14 +987,238 @@
           <w:color w:val="444444"/>
           <w:sz w:val="24"/>
         </w:rPr>
-        <w:t>lib/constants/: UI tokens — AppColors, TextStyles, and API constants.</w:t>
+        <w:t>The FirebaseService (lib/services/firebase_service.dart) is the central API hub. It implements complex cloud logic including Staging, Batch Writes, and Audit Logs.</w:t>
+      </w:r>
+    </w:p>
+    <w:tbl>
+      <w:tblPr>
+        <w:tblStyle w:val="TableGrid"/>
+        <w:tblW w:type="auto" w:w="0"/>
+        <w:jc w:val="center"/>
+        <w:tblLook w:firstColumn="1" w:firstRow="1" w:lastColumn="0" w:lastRow="0" w:noHBand="0" w:noVBand="1" w:val="04A0"/>
+      </w:tblPr>
+      <w:tblGrid>
+        <w:gridCol w:w="4561"/>
+        <w:gridCol w:w="4561"/>
+      </w:tblGrid>
+      <w:tr>
+        <w:tc>
+          <w:tcPr>
+            <w:tcW w:type="dxa" w:w="4561"/>
+            <w:shd w:val="clear" w:color="auto" w:fill="1A1A2E"/>
+          </w:tcPr>
+          <w:p>
+            <w:pPr>
+              <w:jc w:val="center"/>
+            </w:pPr>
+            <w:r>
+              <w:rPr>
+                <w:rFonts w:ascii="Aptos" w:hAnsi="Aptos" w:cs="Aptos" w:eastAsia="Aptos"/>
+                <w:b/>
+                <w:i w:val="0"/>
+                <w:color w:val="FFFFFF"/>
+                <w:sz w:val="22"/>
+              </w:rPr>
+              <w:t>Module</w:t>
+            </w:r>
+          </w:p>
+        </w:tc>
+        <w:tc>
+          <w:tcPr>
+            <w:tcW w:type="dxa" w:w="4561"/>
+            <w:shd w:val="clear" w:color="auto" w:fill="1A1A2E"/>
+          </w:tcPr>
+          <w:p>
+            <w:pPr>
+              <w:jc w:val="center"/>
+            </w:pPr>
+            <w:r>
+              <w:rPr>
+                <w:rFonts w:ascii="Aptos" w:hAnsi="Aptos" w:cs="Aptos" w:eastAsia="Aptos"/>
+                <w:b/>
+                <w:i w:val="0"/>
+                <w:color w:val="FFFFFF"/>
+                <w:sz w:val="22"/>
+              </w:rPr>
+              <w:t>Capability</w:t>
+            </w:r>
+          </w:p>
+        </w:tc>
+      </w:tr>
+      <w:tr>
+        <w:tc>
+          <w:tcPr>
+            <w:tcW w:type="dxa" w:w="4561"/>
+            <w:shd w:val="clear" w:color="auto" w:fill="F5F5F5"/>
+          </w:tcPr>
+          <w:p>
+            <w:r>
+              <w:rPr>
+                <w:rFonts w:ascii="Aptos" w:hAnsi="Aptos" w:cs="Aptos" w:eastAsia="Aptos"/>
+                <w:b w:val="0"/>
+                <w:i w:val="0"/>
+                <w:color w:val="444444"/>
+                <w:sz w:val="20"/>
+              </w:rPr>
+              <w:t>Staging</w:t>
+            </w:r>
+          </w:p>
+        </w:tc>
+        <w:tc>
+          <w:tcPr>
+            <w:tcW w:type="dxa" w:w="4561"/>
+            <w:shd w:val="clear" w:color="auto" w:fill="F5F5F5"/>
+          </w:tcPr>
+          <w:p>
+            <w:r>
+              <w:rPr>
+                <w:rFonts w:ascii="Aptos" w:hAnsi="Aptos" w:cs="Aptos" w:eastAsia="Aptos"/>
+                <w:b w:val="0"/>
+                <w:i w:val="0"/>
+                <w:color w:val="444444"/>
+                <w:sz w:val="20"/>
+              </w:rPr>
+              <w:t>Drafting changes in a separate collection for admin review.</w:t>
+            </w:r>
+          </w:p>
+        </w:tc>
+      </w:tr>
+      <w:tr>
+        <w:tc>
+          <w:tcPr>
+            <w:tcW w:type="dxa" w:w="4561"/>
+            <w:shd w:val="clear" w:color="auto" w:fill="FFFFFF"/>
+          </w:tcPr>
+          <w:p>
+            <w:r>
+              <w:rPr>
+                <w:rFonts w:ascii="Aptos" w:hAnsi="Aptos" w:cs="Aptos" w:eastAsia="Aptos"/>
+                <w:b w:val="0"/>
+                <w:i w:val="0"/>
+                <w:color w:val="444444"/>
+                <w:sz w:val="20"/>
+              </w:rPr>
+              <w:t>Audit Logs</w:t>
+            </w:r>
+          </w:p>
+        </w:tc>
+        <w:tc>
+          <w:tcPr>
+            <w:tcW w:type="dxa" w:w="4561"/>
+            <w:shd w:val="clear" w:color="auto" w:fill="FFFFFF"/>
+          </w:tcPr>
+          <w:p>
+            <w:r>
+              <w:rPr>
+                <w:rFonts w:ascii="Aptos" w:hAnsi="Aptos" w:cs="Aptos" w:eastAsia="Aptos"/>
+                <w:b w:val="0"/>
+                <w:i w:val="0"/>
+                <w:color w:val="444444"/>
+                <w:sz w:val="20"/>
+              </w:rPr>
+              <w:t>Tracking every admin write (Admin ID, Doc ID, Action).</w:t>
+            </w:r>
+          </w:p>
+        </w:tc>
+      </w:tr>
+      <w:tr>
+        <w:tc>
+          <w:tcPr>
+            <w:tcW w:type="dxa" w:w="4561"/>
+            <w:shd w:val="clear" w:color="auto" w:fill="F5F5F5"/>
+          </w:tcPr>
+          <w:p>
+            <w:r>
+              <w:rPr>
+                <w:rFonts w:ascii="Aptos" w:hAnsi="Aptos" w:cs="Aptos" w:eastAsia="Aptos"/>
+                <w:b w:val="0"/>
+                <w:i w:val="0"/>
+                <w:color w:val="444444"/>
+                <w:sz w:val="20"/>
+              </w:rPr>
+              <w:t>Product API</w:t>
+            </w:r>
+          </w:p>
+        </w:tc>
+        <w:tc>
+          <w:tcPr>
+            <w:tcW w:type="dxa" w:w="4561"/>
+            <w:shd w:val="clear" w:color="auto" w:fill="F5F5F5"/>
+          </w:tcPr>
+          <w:p>
+            <w:r>
+              <w:rPr>
+                <w:rFonts w:ascii="Aptos" w:hAnsi="Aptos" w:cs="Aptos" w:eastAsia="Aptos"/>
+                <w:b w:val="0"/>
+                <w:i w:val="0"/>
+                <w:color w:val="444444"/>
+                <w:sz w:val="20"/>
+              </w:rPr>
+              <w:t>Fetching filtered streams based on status (Draft/Published).</w:t>
+            </w:r>
+          </w:p>
+        </w:tc>
+      </w:tr>
+      <w:tr>
+        <w:tc>
+          <w:tcPr>
+            <w:tcW w:type="dxa" w:w="4561"/>
+            <w:shd w:val="clear" w:color="auto" w:fill="FFFFFF"/>
+          </w:tcPr>
+          <w:p>
+            <w:r>
+              <w:rPr>
+                <w:rFonts w:ascii="Aptos" w:hAnsi="Aptos" w:cs="Aptos" w:eastAsia="Aptos"/>
+                <w:b w:val="0"/>
+                <w:i w:val="0"/>
+                <w:color w:val="444444"/>
+                <w:sz w:val="20"/>
+              </w:rPr>
+              <w:t>Order Engine</w:t>
+            </w:r>
+          </w:p>
+        </w:tc>
+        <w:tc>
+          <w:tcPr>
+            <w:tcW w:type="dxa" w:w="4561"/>
+            <w:shd w:val="clear" w:color="auto" w:fill="FFFFFF"/>
+          </w:tcPr>
+          <w:p>
+            <w:r>
+              <w:rPr>
+                <w:rFonts w:ascii="Aptos" w:hAnsi="Aptos" w:cs="Aptos" w:eastAsia="Aptos"/>
+                <w:b w:val="0"/>
+                <w:i w:val="0"/>
+                <w:color w:val="444444"/>
+                <w:sz w:val="20"/>
+              </w:rPr>
+              <w:t>Atomic transaction handling for high-integrity orders.</w:t>
+            </w:r>
+          </w:p>
+        </w:tc>
+      </w:tr>
+    </w:tbl>
+    <w:p/>
+    <w:p>
+      <w:pPr>
+        <w:spacing w:before="280" w:after="60"/>
+      </w:pPr>
+      <w:r>
+        <w:rPr>
+          <w:rFonts w:ascii="Aptos" w:hAnsi="Aptos" w:cs="Aptos" w:eastAsia="Aptos"/>
+          <w:b/>
+          <w:i w:val="0"/>
+          <w:color w:val="1A1A2E"/>
+          <w:sz w:val="30"/>
+        </w:rPr>
+        <w:t>3.2 SecureLocalStorageService</w:t>
       </w:r>
     </w:p>
     <w:p>
       <w:pPr>
-        <w:pStyle w:val="ListBullet"/>
-        <w:spacing w:after="80"/>
-        <w:ind w:left="432"/>
+        <w:spacing w:after="160"/>
+        <w:ind w:firstLine="0"/>
+        <w:jc w:val="both"/>
       </w:pPr>
       <w:r>
         <w:rPr>
@@ -1013,92 +1228,7 @@
           <w:color w:val="444444"/>
           <w:sz w:val="24"/>
         </w:rPr>
-        <w:t>lib/models/: Typed Dart classes for Products, Orders, CartItems, and Users.</w:t>
-      </w:r>
-    </w:p>
-    <w:p>
-      <w:pPr>
-        <w:pStyle w:val="ListBullet"/>
-        <w:spacing w:after="80"/>
-        <w:ind w:left="432"/>
-      </w:pPr>
-      <w:r>
-        <w:rPr>
-          <w:rFonts w:ascii="Aptos" w:hAnsi="Aptos" w:cs="Aptos" w:eastAsia="Aptos"/>
-          <w:b w:val="0"/>
-          <w:i w:val="0"/>
-          <w:color w:val="444444"/>
-          <w:sz w:val="24"/>
-        </w:rPr>
-        <w:t>lib/providers/: State containers (ChangeNotifier) for various app modules.</w:t>
-      </w:r>
-    </w:p>
-    <w:p>
-      <w:pPr>
-        <w:pStyle w:val="ListBullet"/>
-        <w:spacing w:after="80"/>
-        <w:ind w:left="432"/>
-      </w:pPr>
-      <w:r>
-        <w:rPr>
-          <w:rFonts w:ascii="Aptos" w:hAnsi="Aptos" w:cs="Aptos" w:eastAsia="Aptos"/>
-          <w:b w:val="0"/>
-          <w:i w:val="0"/>
-          <w:color w:val="444444"/>
-          <w:sz w:val="24"/>
-        </w:rPr>
-        <w:t>lib/screens/: UI screens organized by domain (auth, home, product, cart, admin).</w:t>
-      </w:r>
-    </w:p>
-    <w:p>
-      <w:pPr>
-        <w:pStyle w:val="ListBullet"/>
-        <w:spacing w:after="80"/>
-        <w:ind w:left="432"/>
-      </w:pPr>
-      <w:r>
-        <w:rPr>
-          <w:rFonts w:ascii="Aptos" w:hAnsi="Aptos" w:cs="Aptos" w:eastAsia="Aptos"/>
-          <w:b w:val="0"/>
-          <w:i w:val="0"/>
-          <w:color w:val="444444"/>
-          <w:sz w:val="24"/>
-        </w:rPr>
-        <w:t>lib/services/: Backend interaction (FirebaseService) and hardware access.</w:t>
-      </w:r>
-    </w:p>
-    <w:p>
-      <w:pPr>
-        <w:pStyle w:val="ListBullet"/>
-        <w:spacing w:after="80"/>
-        <w:ind w:left="432"/>
-      </w:pPr>
-      <w:r>
-        <w:rPr>
-          <w:rFonts w:ascii="Aptos" w:hAnsi="Aptos" w:cs="Aptos" w:eastAsia="Aptos"/>
-          <w:b w:val="0"/>
-          <w:i w:val="0"/>
-          <w:color w:val="444444"/>
-          <w:sz w:val="24"/>
-        </w:rPr>
-        <w:t>lib/widgets/: Project-wide reusable UI components.</w:t>
-      </w:r>
-    </w:p>
-    <w:p>
-      <w:pPr>
-        <w:pStyle w:val="ListBullet"/>
-        <w:spacing w:after="80"/>
-        <w:ind w:left="432"/>
-      </w:pPr>
-      <w:r>
-        <w:rPr>
-          <w:rFonts w:ascii="Aptos" w:hAnsi="Aptos" w:cs="Aptos" w:eastAsia="Aptos"/>
-          <w:b w:val="0"/>
-          <w:i w:val="0"/>
-          <w:color w:val="444444"/>
-          <w:sz w:val="24"/>
-        </w:rPr>
-        <w:t>docs/engineering/: Comprehensive technical documentation and VAPT reports.</w:t>
+        <w:t>Unlike standard SharedPreferences, this service uses AES encryption via flutter_secure_storage. It is mandatory for storing any string that could identify a user (UID, Token, Role).</w:t>
       </w:r>
     </w:p>
     <w:p>
@@ -1113,7 +1243,7 @@
           <w:color w:val="1A1A2E"/>
           <w:sz w:val="40"/>
         </w:rPr>
-        <w:t>3. Environment Setup</w:t>
+        <w:t>4. State Management (Provider Stack)</w:t>
       </w:r>
     </w:p>
     <w:p>
@@ -1126,17 +1256,19 @@
     </w:p>
     <w:p>
       <w:pPr>
-        <w:spacing w:before="280" w:after="60"/>
+        <w:spacing w:after="160"/>
+        <w:ind w:firstLine="0"/>
+        <w:jc w:val="both"/>
       </w:pPr>
       <w:r>
         <w:rPr>
           <w:rFonts w:ascii="Aptos" w:hAnsi="Aptos" w:cs="Aptos" w:eastAsia="Aptos"/>
-          <w:b/>
+          <w:b w:val="0"/>
           <w:i w:val="0"/>
-          <w:color w:val="1A1A2E"/>
-          <w:sz w:val="30"/>
+          <w:color w:val="444444"/>
+          <w:sz w:val="24"/>
         </w:rPr>
-        <w:t>3.1 Prerequisites</w:t>
+        <w:t>The MultiProvider setup in main.dart defines the dependency hierarchy of the application.</w:t>
       </w:r>
     </w:p>
     <w:tbl>
@@ -1169,7 +1301,7 @@
                 <w:color w:val="FFFFFF"/>
                 <w:sz w:val="22"/>
               </w:rPr>
-              <w:t>Component</w:t>
+              <w:t>Provider</w:t>
             </w:r>
           </w:p>
         </w:tc>
@@ -1190,7 +1322,7 @@
                 <w:color w:val="FFFFFF"/>
                 <w:sz w:val="22"/>
               </w:rPr>
-              <w:t>Requirement</w:t>
+              <w:t>Primary Logic</w:t>
             </w:r>
           </w:p>
         </w:tc>
@@ -1211,7 +1343,7 @@
                 <w:color w:val="FFFFFF"/>
                 <w:sz w:val="22"/>
               </w:rPr>
-              <w:t>Source</w:t>
+              <w:t>Dependency</w:t>
             </w:r>
           </w:p>
         </w:tc>
@@ -1231,7 +1363,7 @@
                 <w:color w:val="444444"/>
                 <w:sz w:val="20"/>
               </w:rPr>
-              <w:t>Flutter SDK</w:t>
+              <w:t>AuthProvider</w:t>
             </w:r>
           </w:p>
         </w:tc>
@@ -1249,7 +1381,7 @@
                 <w:color w:val="444444"/>
                 <w:sz w:val="20"/>
               </w:rPr>
-              <w:t>&gt;= 3.32.0</w:t>
+              <w:t>OTP logic, Role verification, Profile sync.</w:t>
             </w:r>
           </w:p>
         </w:tc>
@@ -1267,7 +1399,7 @@
                 <w:color w:val="444444"/>
                 <w:sz w:val="20"/>
               </w:rPr>
-              <w:t>flutter.dev</w:t>
+              <w:t>None (Root)</w:t>
             </w:r>
           </w:p>
         </w:tc>
@@ -1287,7 +1419,7 @@
                 <w:color w:val="444444"/>
                 <w:sz w:val="20"/>
               </w:rPr>
-              <w:t>Android Studio</w:t>
+              <w:t>ProductProvider</w:t>
             </w:r>
           </w:p>
         </w:tc>
@@ -1305,7 +1437,7 @@
                 <w:color w:val="444444"/>
                 <w:sz w:val="20"/>
               </w:rPr>
-              <w:t>Hedgehog+</w:t>
+              <w:t>Catalog streaming, Category filtering.</w:t>
             </w:r>
           </w:p>
         </w:tc>
@@ -1323,7 +1455,7 @@
                 <w:color w:val="444444"/>
                 <w:sz w:val="20"/>
               </w:rPr>
-              <w:t>developer.android.com</w:t>
+              <w:t>Auth (Role-based price)</w:t>
             </w:r>
           </w:p>
         </w:tc>
@@ -1343,7 +1475,7 @@
                 <w:color w:val="444444"/>
                 <w:sz w:val="20"/>
               </w:rPr>
-              <w:t>Java JDK</w:t>
+              <w:t>CartProvider</w:t>
             </w:r>
           </w:p>
         </w:tc>
@@ -1361,7 +1493,7 @@
                 <w:color w:val="444444"/>
                 <w:sz w:val="20"/>
               </w:rPr>
-              <w:t>17 (LTS)</w:t>
+              <w:t>Local/Cloud basket sync, Item arithmetic.</w:t>
             </w:r>
           </w:p>
         </w:tc>
@@ -1379,7 +1511,7 @@
                 <w:color w:val="444444"/>
                 <w:sz w:val="20"/>
               </w:rPr>
-              <w:t>JDK Vendor distribution</w:t>
+              <w:t>Auth (UID matching)</w:t>
             </w:r>
           </w:p>
         </w:tc>
@@ -1399,7 +1531,7 @@
                 <w:color w:val="444444"/>
                 <w:sz w:val="20"/>
               </w:rPr>
-              <w:t>Firebase CLI</w:t>
+              <w:t>PreviewProvider</w:t>
             </w:r>
           </w:p>
         </w:tc>
@@ -1417,7 +1549,7 @@
                 <w:color w:val="444444"/>
                 <w:sz w:val="20"/>
               </w:rPr>
-              <w:t>Latest (npm)</w:t>
+              <w:t>Merging staged vs live data for admin view.</w:t>
             </w:r>
           </w:p>
         </w:tc>
@@ -1435,113 +1567,13 @@
                 <w:color w:val="444444"/>
                 <w:sz w:val="20"/>
               </w:rPr>
-              <w:t>Firebase Console</w:t>
+              <w:t>Firebase (Staging coll)</w:t>
             </w:r>
           </w:p>
         </w:tc>
       </w:tr>
     </w:tbl>
     <w:p/>
-    <w:p>
-      <w:pPr>
-        <w:spacing w:before="280" w:after="60"/>
-      </w:pPr>
-      <w:r>
-        <w:rPr>
-          <w:rFonts w:ascii="Aptos" w:hAnsi="Aptos" w:cs="Aptos" w:eastAsia="Aptos"/>
-          <w:b/>
-          <w:i w:val="0"/>
-          <w:color w:val="1A1A2E"/>
-          <w:sz w:val="30"/>
-        </w:rPr>
-        <w:t>3.2 Quick Start</w:t>
-      </w:r>
-    </w:p>
-    <w:p>
-      <w:pPr>
-        <w:spacing w:after="160"/>
-        <w:ind w:firstLine="0"/>
-        <w:jc w:val="both"/>
-      </w:pPr>
-      <w:r>
-        <w:rPr>
-          <w:rFonts w:ascii="Aptos" w:hAnsi="Aptos" w:cs="Aptos" w:eastAsia="Aptos"/>
-          <w:b w:val="0"/>
-          <w:i w:val="0"/>
-          <w:color w:val="444444"/>
-          <w:sz w:val="24"/>
-        </w:rPr>
-        <w:t>Run the following commands in sequence to initialize the development environment.</w:t>
-      </w:r>
-    </w:p>
-    <w:p>
-      <w:pPr>
-        <w:spacing w:after="160"/>
-        <w:ind w:firstLine="0"/>
-        <w:jc w:val="both"/>
-      </w:pPr>
-      <w:r>
-        <w:rPr>
-          <w:rFonts w:ascii="Aptos" w:hAnsi="Aptos" w:cs="Aptos" w:eastAsia="Aptos"/>
-          <w:b w:val="0"/>
-          <w:i w:val="0"/>
-          <w:color w:val="444444"/>
-          <w:sz w:val="24"/>
-        </w:rPr>
-        <w:t>1. git clone &lt;repository-url&gt;</w:t>
-      </w:r>
-    </w:p>
-    <w:p>
-      <w:pPr>
-        <w:spacing w:after="160"/>
-        <w:ind w:firstLine="0"/>
-        <w:jc w:val="both"/>
-      </w:pPr>
-      <w:r>
-        <w:rPr>
-          <w:rFonts w:ascii="Aptos" w:hAnsi="Aptos" w:cs="Aptos" w:eastAsia="Aptos"/>
-          <w:b w:val="0"/>
-          <w:i w:val="0"/>
-          <w:color w:val="444444"/>
-          <w:sz w:val="24"/>
-        </w:rPr>
-        <w:t>2. flutter pub get</w:t>
-      </w:r>
-    </w:p>
-    <w:p>
-      <w:pPr>
-        <w:spacing w:after="160"/>
-        <w:ind w:firstLine="0"/>
-        <w:jc w:val="both"/>
-      </w:pPr>
-      <w:r>
-        <w:rPr>
-          <w:rFonts w:ascii="Aptos" w:hAnsi="Aptos" w:cs="Aptos" w:eastAsia="Aptos"/>
-          <w:b w:val="0"/>
-          <w:i w:val="0"/>
-          <w:color w:val="444444"/>
-          <w:sz w:val="24"/>
-        </w:rPr>
-        <w:t>3. Place 'google-services.json' in android/app/</w:t>
-      </w:r>
-    </w:p>
-    <w:p>
-      <w:pPr>
-        <w:spacing w:after="160"/>
-        <w:ind w:firstLine="0"/>
-        <w:jc w:val="both"/>
-      </w:pPr>
-      <w:r>
-        <w:rPr>
-          <w:rFonts w:ascii="Aptos" w:hAnsi="Aptos" w:cs="Aptos" w:eastAsia="Aptos"/>
-          <w:b w:val="0"/>
-          <w:i w:val="0"/>
-          <w:color w:val="444444"/>
-          <w:sz w:val="24"/>
-        </w:rPr>
-        <w:t>4. flutter run</w:t>
-      </w:r>
-    </w:p>
     <w:p>
       <w:pPr>
         <w:spacing w:before="360" w:after="80"/>
@@ -1554,7 +1586,7 @@
           <w:color w:val="1A1A2E"/>
           <w:sz w:val="40"/>
         </w:rPr>
-        <w:t>4. Dependency Management</w:t>
+        <w:t>5. Administrative Staging Workflow</w:t>
       </w:r>
     </w:p>
     <w:p>
@@ -1579,368 +1611,77 @@
           <w:color w:val="444444"/>
           <w:sz w:val="24"/>
         </w:rPr>
-        <w:t>Core dependencies are strictly version-pinned in pubspec.yaml to ensure build repeatability.</w:t>
+        <w:t>The app enforces a 'Standard Change' process to avoid catalog corruption.</w:t>
       </w:r>
     </w:p>
-    <w:tbl>
-      <w:tblPr>
-        <w:tblStyle w:val="TableGrid"/>
-        <w:tblW w:type="auto" w:w="0"/>
-        <w:jc w:val="center"/>
-        <w:tblLook w:firstColumn="1" w:firstRow="1" w:lastColumn="0" w:lastRow="0" w:noHBand="0" w:noVBand="1" w:val="04A0"/>
-      </w:tblPr>
-      <w:tblGrid>
-        <w:gridCol w:w="3041"/>
-        <w:gridCol w:w="3041"/>
-        <w:gridCol w:w="3041"/>
-      </w:tblGrid>
-      <w:tr>
-        <w:tc>
-          <w:tcPr>
-            <w:tcW w:type="dxa" w:w="3041"/>
-            <w:shd w:val="clear" w:color="auto" w:fill="1A1A2E"/>
-          </w:tcPr>
-          <w:p>
-            <w:pPr>
-              <w:jc w:val="center"/>
-            </w:pPr>
-            <w:r>
-              <w:rPr>
-                <w:rFonts w:ascii="Aptos" w:hAnsi="Aptos" w:cs="Aptos" w:eastAsia="Aptos"/>
-                <w:b/>
-                <w:i w:val="0"/>
-                <w:color w:val="FFFFFF"/>
-                <w:sz w:val="22"/>
-              </w:rPr>
-              <w:t>Package</w:t>
-            </w:r>
-          </w:p>
-        </w:tc>
-        <w:tc>
-          <w:tcPr>
-            <w:tcW w:type="dxa" w:w="3041"/>
-            <w:shd w:val="clear" w:color="auto" w:fill="1A1A2E"/>
-          </w:tcPr>
-          <w:p>
-            <w:pPr>
-              <w:jc w:val="center"/>
-            </w:pPr>
-            <w:r>
-              <w:rPr>
-                <w:rFonts w:ascii="Aptos" w:hAnsi="Aptos" w:cs="Aptos" w:eastAsia="Aptos"/>
-                <w:b/>
-                <w:i w:val="0"/>
-                <w:color w:val="FFFFFF"/>
-                <w:sz w:val="22"/>
-              </w:rPr>
-              <w:t>Purpose</w:t>
-            </w:r>
-          </w:p>
-        </w:tc>
-        <w:tc>
-          <w:tcPr>
-            <w:tcW w:type="dxa" w:w="3041"/>
-            <w:shd w:val="clear" w:color="auto" w:fill="1A1A2E"/>
-          </w:tcPr>
-          <w:p>
-            <w:pPr>
-              <w:jc w:val="center"/>
-            </w:pPr>
-            <w:r>
-              <w:rPr>
-                <w:rFonts w:ascii="Aptos" w:hAnsi="Aptos" w:cs="Aptos" w:eastAsia="Aptos"/>
-                <w:b/>
-                <w:i w:val="0"/>
-                <w:color w:val="FFFFFF"/>
-                <w:sz w:val="22"/>
-              </w:rPr>
-              <w:t>Critically</w:t>
-            </w:r>
-          </w:p>
-        </w:tc>
-      </w:tr>
-      <w:tr>
-        <w:tc>
-          <w:tcPr>
-            <w:tcW w:type="dxa" w:w="3041"/>
-            <w:shd w:val="clear" w:color="auto" w:fill="F5F5F5"/>
-          </w:tcPr>
-          <w:p>
-            <w:r>
-              <w:rPr>
-                <w:rFonts w:ascii="Aptos" w:hAnsi="Aptos" w:cs="Aptos" w:eastAsia="Aptos"/>
-                <w:b w:val="0"/>
-                <w:i w:val="0"/>
-                <w:color w:val="444444"/>
-                <w:sz w:val="20"/>
-              </w:rPr>
-              <w:t>provider</w:t>
-            </w:r>
-          </w:p>
-        </w:tc>
-        <w:tc>
-          <w:tcPr>
-            <w:tcW w:type="dxa" w:w="3041"/>
-            <w:shd w:val="clear" w:color="auto" w:fill="F5F5F5"/>
-          </w:tcPr>
-          <w:p>
-            <w:r>
-              <w:rPr>
-                <w:rFonts w:ascii="Aptos" w:hAnsi="Aptos" w:cs="Aptos" w:eastAsia="Aptos"/>
-                <w:b w:val="0"/>
-                <w:i w:val="0"/>
-                <w:color w:val="444444"/>
-                <w:sz w:val="20"/>
-              </w:rPr>
-              <w:t>State Management</w:t>
-            </w:r>
-          </w:p>
-        </w:tc>
-        <w:tc>
-          <w:tcPr>
-            <w:tcW w:type="dxa" w:w="3041"/>
-            <w:shd w:val="clear" w:color="auto" w:fill="F5F5F5"/>
-          </w:tcPr>
-          <w:p>
-            <w:r>
-              <w:rPr>
-                <w:rFonts w:ascii="Aptos" w:hAnsi="Aptos" w:cs="Aptos" w:eastAsia="Aptos"/>
-                <w:b w:val="0"/>
-                <w:i w:val="0"/>
-                <w:color w:val="444444"/>
-                <w:sz w:val="20"/>
-              </w:rPr>
-              <w:t>High</w:t>
-            </w:r>
-          </w:p>
-        </w:tc>
-      </w:tr>
-      <w:tr>
-        <w:tc>
-          <w:tcPr>
-            <w:tcW w:type="dxa" w:w="3041"/>
-            <w:shd w:val="clear" w:color="auto" w:fill="FFFFFF"/>
-          </w:tcPr>
-          <w:p>
-            <w:r>
-              <w:rPr>
-                <w:rFonts w:ascii="Aptos" w:hAnsi="Aptos" w:cs="Aptos" w:eastAsia="Aptos"/>
-                <w:b w:val="0"/>
-                <w:i w:val="0"/>
-                <w:color w:val="444444"/>
-                <w:sz w:val="20"/>
-              </w:rPr>
-              <w:t>firebase_core</w:t>
-            </w:r>
-          </w:p>
-        </w:tc>
-        <w:tc>
-          <w:tcPr>
-            <w:tcW w:type="dxa" w:w="3041"/>
-            <w:shd w:val="clear" w:color="auto" w:fill="FFFFFF"/>
-          </w:tcPr>
-          <w:p>
-            <w:r>
-              <w:rPr>
-                <w:rFonts w:ascii="Aptos" w:hAnsi="Aptos" w:cs="Aptos" w:eastAsia="Aptos"/>
-                <w:b w:val="0"/>
-                <w:i w:val="0"/>
-                <w:color w:val="444444"/>
-                <w:sz w:val="20"/>
-              </w:rPr>
-              <w:t>Infrastructure</w:t>
-            </w:r>
-          </w:p>
-        </w:tc>
-        <w:tc>
-          <w:tcPr>
-            <w:tcW w:type="dxa" w:w="3041"/>
-            <w:shd w:val="clear" w:color="auto" w:fill="FFFFFF"/>
-          </w:tcPr>
-          <w:p>
-            <w:r>
-              <w:rPr>
-                <w:rFonts w:ascii="Aptos" w:hAnsi="Aptos" w:cs="Aptos" w:eastAsia="Aptos"/>
-                <w:b w:val="0"/>
-                <w:i w:val="0"/>
-                <w:color w:val="444444"/>
-                <w:sz w:val="20"/>
-              </w:rPr>
-              <w:t>High</w:t>
-            </w:r>
-          </w:p>
-        </w:tc>
-      </w:tr>
-      <w:tr>
-        <w:tc>
-          <w:tcPr>
-            <w:tcW w:type="dxa" w:w="3041"/>
-            <w:shd w:val="clear" w:color="auto" w:fill="F5F5F5"/>
-          </w:tcPr>
-          <w:p>
-            <w:r>
-              <w:rPr>
-                <w:rFonts w:ascii="Aptos" w:hAnsi="Aptos" w:cs="Aptos" w:eastAsia="Aptos"/>
-                <w:b w:val="0"/>
-                <w:i w:val="0"/>
-                <w:color w:val="444444"/>
-                <w:sz w:val="20"/>
-              </w:rPr>
-              <w:t>flutter_secure_storage</w:t>
-            </w:r>
-          </w:p>
-        </w:tc>
-        <w:tc>
-          <w:tcPr>
-            <w:tcW w:type="dxa" w:w="3041"/>
-            <w:shd w:val="clear" w:color="auto" w:fill="F5F5F5"/>
-          </w:tcPr>
-          <w:p>
-            <w:r>
-              <w:rPr>
-                <w:rFonts w:ascii="Aptos" w:hAnsi="Aptos" w:cs="Aptos" w:eastAsia="Aptos"/>
-                <w:b w:val="0"/>
-                <w:i w:val="0"/>
-                <w:color w:val="444444"/>
-                <w:sz w:val="20"/>
-              </w:rPr>
-              <w:t>PII Security</w:t>
-            </w:r>
-          </w:p>
-        </w:tc>
-        <w:tc>
-          <w:tcPr>
-            <w:tcW w:type="dxa" w:w="3041"/>
-            <w:shd w:val="clear" w:color="auto" w:fill="F5F5F5"/>
-          </w:tcPr>
-          <w:p>
-            <w:r>
-              <w:rPr>
-                <w:rFonts w:ascii="Aptos" w:hAnsi="Aptos" w:cs="Aptos" w:eastAsia="Aptos"/>
-                <w:b w:val="0"/>
-                <w:i w:val="0"/>
-                <w:color w:val="444444"/>
-                <w:sz w:val="20"/>
-              </w:rPr>
-              <w:t>Critical</w:t>
-            </w:r>
-          </w:p>
-        </w:tc>
-      </w:tr>
-      <w:tr>
-        <w:tc>
-          <w:tcPr>
-            <w:tcW w:type="dxa" w:w="3041"/>
-            <w:shd w:val="clear" w:color="auto" w:fill="FFFFFF"/>
-          </w:tcPr>
-          <w:p>
-            <w:r>
-              <w:rPr>
-                <w:rFonts w:ascii="Aptos" w:hAnsi="Aptos" w:cs="Aptos" w:eastAsia="Aptos"/>
-                <w:b w:val="0"/>
-                <w:i w:val="0"/>
-                <w:color w:val="444444"/>
-                <w:sz w:val="20"/>
-              </w:rPr>
-              <w:t>cached_network_image</w:t>
-            </w:r>
-          </w:p>
-        </w:tc>
-        <w:tc>
-          <w:tcPr>
-            <w:tcW w:type="dxa" w:w="3041"/>
-            <w:shd w:val="clear" w:color="auto" w:fill="FFFFFF"/>
-          </w:tcPr>
-          <w:p>
-            <w:r>
-              <w:rPr>
-                <w:rFonts w:ascii="Aptos" w:hAnsi="Aptos" w:cs="Aptos" w:eastAsia="Aptos"/>
-                <w:b w:val="0"/>
-                <w:i w:val="0"/>
-                <w:color w:val="444444"/>
-                <w:sz w:val="20"/>
-              </w:rPr>
-              <w:t>Performance</w:t>
-            </w:r>
-          </w:p>
-        </w:tc>
-        <w:tc>
-          <w:tcPr>
-            <w:tcW w:type="dxa" w:w="3041"/>
-            <w:shd w:val="clear" w:color="auto" w:fill="FFFFFF"/>
-          </w:tcPr>
-          <w:p>
-            <w:r>
-              <w:rPr>
-                <w:rFonts w:ascii="Aptos" w:hAnsi="Aptos" w:cs="Aptos" w:eastAsia="Aptos"/>
-                <w:b w:val="0"/>
-                <w:i w:val="0"/>
-                <w:color w:val="444444"/>
-                <w:sz w:val="20"/>
-              </w:rPr>
-              <w:t>Medium</w:t>
-            </w:r>
-          </w:p>
-        </w:tc>
-      </w:tr>
-      <w:tr>
-        <w:tc>
-          <w:tcPr>
-            <w:tcW w:type="dxa" w:w="3041"/>
-            <w:shd w:val="clear" w:color="auto" w:fill="F5F5F5"/>
-          </w:tcPr>
-          <w:p>
-            <w:r>
-              <w:rPr>
-                <w:rFonts w:ascii="Aptos" w:hAnsi="Aptos" w:cs="Aptos" w:eastAsia="Aptos"/>
-                <w:b w:val="0"/>
-                <w:i w:val="0"/>
-                <w:color w:val="444444"/>
-                <w:sz w:val="20"/>
-              </w:rPr>
-              <w:t>uuid</w:t>
-            </w:r>
-          </w:p>
-        </w:tc>
-        <w:tc>
-          <w:tcPr>
-            <w:tcW w:type="dxa" w:w="3041"/>
-            <w:shd w:val="clear" w:color="auto" w:fill="F5F5F5"/>
-          </w:tcPr>
-          <w:p>
-            <w:r>
-              <w:rPr>
-                <w:rFonts w:ascii="Aptos" w:hAnsi="Aptos" w:cs="Aptos" w:eastAsia="Aptos"/>
-                <w:b w:val="0"/>
-                <w:i w:val="0"/>
-                <w:color w:val="444444"/>
-                <w:sz w:val="20"/>
-              </w:rPr>
-              <w:t>Data Integrity</w:t>
-            </w:r>
-          </w:p>
-        </w:tc>
-        <w:tc>
-          <w:tcPr>
-            <w:tcW w:type="dxa" w:w="3041"/>
-            <w:shd w:val="clear" w:color="auto" w:fill="F5F5F5"/>
-          </w:tcPr>
-          <w:p>
-            <w:r>
-              <w:rPr>
-                <w:rFonts w:ascii="Aptos" w:hAnsi="Aptos" w:cs="Aptos" w:eastAsia="Aptos"/>
-                <w:b w:val="0"/>
-                <w:i w:val="0"/>
-                <w:color w:val="444444"/>
-                <w:sz w:val="20"/>
-              </w:rPr>
-              <w:t>Medium</w:t>
-            </w:r>
-          </w:p>
-        </w:tc>
-      </w:tr>
-    </w:tbl>
-    <w:p/>
+    <w:p>
+      <w:pPr>
+        <w:spacing w:after="160"/>
+        <w:ind w:firstLine="0"/>
+        <w:jc w:val="both"/>
+      </w:pPr>
+      <w:r>
+        <w:rPr>
+          <w:rFonts w:ascii="Aptos" w:hAnsi="Aptos" w:cs="Aptos" w:eastAsia="Aptos"/>
+          <w:b w:val="0"/>
+          <w:i w:val="0"/>
+          <w:color w:val="444444"/>
+          <w:sz w:val="24"/>
+        </w:rPr>
+        <w:t>Step 1: Admin edits product or banner details.</w:t>
+      </w:r>
+    </w:p>
+    <w:p>
+      <w:pPr>
+        <w:spacing w:after="160"/>
+        <w:ind w:firstLine="0"/>
+        <w:jc w:val="both"/>
+      </w:pPr>
+      <w:r>
+        <w:rPr>
+          <w:rFonts w:ascii="Aptos" w:hAnsi="Aptos" w:cs="Aptos" w:eastAsia="Aptos"/>
+          <w:b w:val="0"/>
+          <w:i w:val="0"/>
+          <w:color w:val="444444"/>
+          <w:sz w:val="24"/>
+        </w:rPr>
+        <w:t>Step 2: Changes are written to the 'staging' collection (status=pending).</w:t>
+      </w:r>
+    </w:p>
+    <w:p>
+      <w:pPr>
+        <w:spacing w:after="160"/>
+        <w:ind w:firstLine="0"/>
+        <w:jc w:val="both"/>
+      </w:pPr>
+      <w:r>
+        <w:rPr>
+          <w:rFonts w:ascii="Aptos" w:hAnsi="Aptos" w:cs="Aptos" w:eastAsia="Aptos"/>
+          <w:b w:val="0"/>
+          <w:i w:val="0"/>
+          <w:color w:val="444444"/>
+          <w:sz w:val="24"/>
+        </w:rPr>
+        <w:t>Step 3: Admin reviews the 'Staging Preview' screen (PreviewProvider).</w:t>
+      </w:r>
+    </w:p>
+    <w:p>
+      <w:pPr>
+        <w:spacing w:after="160"/>
+        <w:ind w:firstLine="0"/>
+        <w:jc w:val="both"/>
+      </w:pPr>
+      <w:r>
+        <w:rPr>
+          <w:rFonts w:ascii="Aptos" w:hAnsi="Aptos" w:cs="Aptos" w:eastAsia="Aptos"/>
+          <w:b w:val="0"/>
+          <w:i w:val="0"/>
+          <w:color w:val="444444"/>
+          <w:sz w:val="24"/>
+        </w:rPr>
+        <w:t>Step 4: Admin clicks 'Publish All' — changes move to live collections.</w:t>
+      </w:r>
+    </w:p>
     <w:p>
       <w:pPr>
         <w:spacing w:before="360" w:after="80"/>
@@ -1953,7 +1694,241 @@
           <w:color w:val="1A1A2E"/>
           <w:sz w:val="40"/>
         </w:rPr>
-        <w:t>5. Coding Standards</w:t>
+        <w:t>6. Security Architecture &amp; VAPT Mitigation</w:t>
+      </w:r>
+    </w:p>
+    <w:p>
+      <w:pPr>
+        <w:spacing w:before="40" w:after="40"/>
+        <w:pBdr>
+          <w:bottom w:val="single" w:sz="8" w:space="1" w:color="D4AF37"/>
+        </w:pBdr>
+      </w:pPr>
+    </w:p>
+    <w:p>
+      <w:pPr>
+        <w:spacing w:before="120" w:after="120"/>
+        <w:jc w:val="both"/>
+      </w:pPr>
+      <w:r>
+        <w:rPr>
+          <w:rFonts w:ascii="Aptos" w:hAnsi="Aptos" w:cs="Aptos" w:eastAsia="Aptos"/>
+          <w:b/>
+          <w:i w:val="0"/>
+          <w:color w:val="D4AF37"/>
+          <w:sz w:val="24"/>
+        </w:rPr>
+        <w:t xml:space="preserve">CRITICAL: </w:t>
+      </w:r>
+      <w:r>
+        <w:rPr>
+          <w:rFonts w:ascii="Aptos" w:hAnsi="Aptos" w:cs="Aptos" w:eastAsia="Aptos"/>
+          <w:b w:val="0"/>
+          <w:i w:val="0"/>
+          <w:color w:val="444444"/>
+          <w:sz w:val="24"/>
+        </w:rPr>
+        <w:t>The following security controls must never be removed or bypassed.</w:t>
+      </w:r>
+    </w:p>
+    <w:p>
+      <w:pPr>
+        <w:spacing w:before="200" w:after="40"/>
+      </w:pPr>
+      <w:r>
+        <w:rPr>
+          <w:rFonts w:ascii="Aptos" w:hAnsi="Aptos" w:cs="Aptos" w:eastAsia="Aptos"/>
+          <w:b/>
+          <w:i w:val="0"/>
+          <w:color w:val="444444"/>
+          <w:sz w:val="26"/>
+        </w:rPr>
+        <w:t>VAPT-001 (PII Security)</w:t>
+      </w:r>
+    </w:p>
+    <w:p>
+      <w:pPr>
+        <w:spacing w:after="160"/>
+        <w:ind w:firstLine="0"/>
+        <w:jc w:val="both"/>
+      </w:pPr>
+      <w:r>
+        <w:rPr>
+          <w:rFonts w:ascii="Aptos" w:hAnsi="Aptos" w:cs="Aptos" w:eastAsia="Aptos"/>
+          <w:b w:val="0"/>
+          <w:i w:val="0"/>
+          <w:color w:val="444444"/>
+          <w:sz w:val="24"/>
+        </w:rPr>
+        <w:t>PII is strictly isolated in the SecureStorage provider. Raw SharedPreferences only stores UI flags.</w:t>
+      </w:r>
+    </w:p>
+    <w:p>
+      <w:pPr>
+        <w:spacing w:before="200" w:after="40"/>
+      </w:pPr>
+      <w:r>
+        <w:rPr>
+          <w:rFonts w:ascii="Aptos" w:hAnsi="Aptos" w:cs="Aptos" w:eastAsia="Aptos"/>
+          <w:b/>
+          <w:i w:val="0"/>
+          <w:color w:val="444444"/>
+          <w:sz w:val="26"/>
+        </w:rPr>
+        <w:t>VAPT-006 (Firestore Rules)</w:t>
+      </w:r>
+    </w:p>
+    <w:p>
+      <w:pPr>
+        <w:spacing w:after="160"/>
+        <w:ind w:firstLine="0"/>
+        <w:jc w:val="both"/>
+      </w:pPr>
+      <w:r>
+        <w:rPr>
+          <w:rFonts w:ascii="Aptos" w:hAnsi="Aptos" w:cs="Aptos" w:eastAsia="Aptos"/>
+          <w:b w:val="0"/>
+          <w:i w:val="0"/>
+          <w:color w:val="444444"/>
+          <w:sz w:val="24"/>
+        </w:rPr>
+        <w:t>Minimum privilege rules: Wholesalers can only read /products/; Admins can write; Others are blocked.</w:t>
+      </w:r>
+    </w:p>
+    <w:p>
+      <w:pPr>
+        <w:spacing w:before="200" w:after="40"/>
+      </w:pPr>
+      <w:r>
+        <w:rPr>
+          <w:rFonts w:ascii="Aptos" w:hAnsi="Aptos" w:cs="Aptos" w:eastAsia="Aptos"/>
+          <w:b/>
+          <w:i w:val="0"/>
+          <w:color w:val="444444"/>
+          <w:sz w:val="26"/>
+        </w:rPr>
+        <w:t>VAPT-012 (Screenshot Protection)</w:t>
+      </w:r>
+    </w:p>
+    <w:p>
+      <w:pPr>
+        <w:spacing w:after="160"/>
+        <w:ind w:firstLine="0"/>
+        <w:jc w:val="both"/>
+      </w:pPr>
+      <w:r>
+        <w:rPr>
+          <w:rFonts w:ascii="Aptos" w:hAnsi="Aptos" w:cs="Aptos" w:eastAsia="Aptos"/>
+          <w:b w:val="0"/>
+          <w:i w:val="0"/>
+          <w:color w:val="444444"/>
+          <w:sz w:val="24"/>
+        </w:rPr>
+        <w:t>The FLAG_SECURE window flag is toggled during initState on sensitive profile and cart screens.</w:t>
+      </w:r>
+    </w:p>
+    <w:p>
+      <w:pPr>
+        <w:spacing w:before="360" w:after="80"/>
+      </w:pPr>
+      <w:r>
+        <w:rPr>
+          <w:rFonts w:ascii="Aptos" w:hAnsi="Aptos" w:cs="Aptos" w:eastAsia="Aptos"/>
+          <w:b/>
+          <w:i w:val="0"/>
+          <w:color w:val="1A1A2E"/>
+          <w:sz w:val="40"/>
+        </w:rPr>
+        <w:t>7. Build &amp; Environment Configuration</w:t>
+      </w:r>
+    </w:p>
+    <w:p>
+      <w:pPr>
+        <w:spacing w:before="40" w:after="40"/>
+        <w:pBdr>
+          <w:bottom w:val="single" w:sz="8" w:space="1" w:color="D4AF37"/>
+        </w:pBdr>
+      </w:pPr>
+    </w:p>
+    <w:p>
+      <w:pPr>
+        <w:spacing w:after="160"/>
+        <w:ind w:firstLine="0"/>
+        <w:jc w:val="both"/>
+      </w:pPr>
+      <w:r>
+        <w:rPr>
+          <w:rFonts w:ascii="Aptos" w:hAnsi="Aptos" w:cs="Aptos" w:eastAsia="Aptos"/>
+          <w:b w:val="0"/>
+          <w:i w:val="0"/>
+          <w:color w:val="444444"/>
+          <w:sz w:val="24"/>
+        </w:rPr>
+        <w:t>We use a Flavor-based setup (dev/prod) to separate Firebase projects. Release builds are optimized with R8 shrinking and obfuscation.</w:t>
+      </w:r>
+    </w:p>
+    <w:p>
+      <w:pPr>
+        <w:spacing w:before="280" w:after="60"/>
+      </w:pPr>
+      <w:r>
+        <w:rPr>
+          <w:rFonts w:ascii="Aptos" w:hAnsi="Aptos" w:cs="Aptos" w:eastAsia="Aptos"/>
+          <w:b/>
+          <w:i w:val="0"/>
+          <w:color w:val="1A1A2E"/>
+          <w:sz w:val="30"/>
+        </w:rPr>
+        <w:t>7.1 Build Commands</w:t>
+      </w:r>
+    </w:p>
+    <w:p>
+      <w:pPr>
+        <w:spacing w:after="160"/>
+        <w:ind w:firstLine="0"/>
+        <w:jc w:val="both"/>
+      </w:pPr>
+      <w:r>
+        <w:rPr>
+          <w:rFonts w:ascii="Aptos" w:hAnsi="Aptos" w:cs="Aptos" w:eastAsia="Aptos"/>
+          <w:b w:val="0"/>
+          <w:i w:val="0"/>
+          <w:color w:val="444444"/>
+          <w:sz w:val="24"/>
+        </w:rPr>
+        <w:t>Standard Release APK: flutter build apk --release</w:t>
+      </w:r>
+    </w:p>
+    <w:p>
+      <w:pPr>
+        <w:spacing w:after="160"/>
+        <w:ind w:firstLine="0"/>
+        <w:jc w:val="both"/>
+      </w:pPr>
+      <w:r>
+        <w:rPr>
+          <w:rFonts w:ascii="Aptos" w:hAnsi="Aptos" w:cs="Aptos" w:eastAsia="Aptos"/>
+          <w:b w:val="0"/>
+          <w:i w:val="0"/>
+          <w:color w:val="444444"/>
+          <w:sz w:val="24"/>
+        </w:rPr>
+        <w:t>Optimization: Build App Bundle (AAB) for Play Store deployment.</w:t>
+      </w:r>
+    </w:p>
+    <w:p>
+      <w:pPr>
+        <w:spacing w:before="360" w:after="80"/>
+      </w:pPr>
+      <w:r>
+        <w:rPr>
+          <w:rFonts w:ascii="Aptos" w:hAnsi="Aptos" w:cs="Aptos" w:eastAsia="Aptos"/>
+          <w:b/>
+          <w:i w:val="0"/>
+          <w:color w:val="1A1A2E"/>
+          <w:sz w:val="40"/>
+        </w:rPr>
+        <w:t>8. Developer Workflow &amp; Standards</w:t>
       </w:r>
     </w:p>
     <w:p>
@@ -1978,7 +1953,7 @@
           <w:color w:val="444444"/>
           <w:sz w:val="24"/>
         </w:rPr>
-        <w:t>Dart Style: Adherence to 'Effective Dart' is mandatory.</w:t>
+        <w:t>PR Pre-check: Run 'flutter analyze' before any commit.</w:t>
       </w:r>
     </w:p>
     <w:p>
@@ -1995,7 +1970,7 @@
           <w:color w:val="444444"/>
           <w:sz w:val="24"/>
         </w:rPr>
-        <w:t>UI Tokens: Never hardcode hex colors; reference AppColors.gold.</w:t>
+        <w:t>Models: Always include 'toJson' and 'fromJson' for API compatibility.</w:t>
       </w:r>
     </w:p>
     <w:p>
@@ -2012,7 +1987,7 @@
           <w:color w:val="444444"/>
           <w:sz w:val="24"/>
         </w:rPr>
-        <w:t>Typing: Avoid 'dynamic'; always use explicit types for data models.</w:t>
+        <w:t>UI Consistency: Reference AppColors.gold instead of specific hex codes.</w:t>
       </w:r>
     </w:p>
     <w:p>
@@ -2029,599 +2004,7 @@
           <w:color w:val="444444"/>
           <w:sz w:val="24"/>
         </w:rPr>
-        <w:t>Performance: Use 'const' constructors for all stateless surfaces.</w:t>
-      </w:r>
-    </w:p>
-    <w:p>
-      <w:pPr>
-        <w:spacing w:before="360" w:after="80"/>
-      </w:pPr>
-      <w:r>
-        <w:rPr>
-          <w:rFonts w:ascii="Aptos" w:hAnsi="Aptos" w:cs="Aptos" w:eastAsia="Aptos"/>
-          <w:b/>
-          <w:i w:val="0"/>
-          <w:color w:val="1A1A2E"/>
-          <w:sz w:val="40"/>
-        </w:rPr>
-        <w:t>6. State Management</w:t>
-      </w:r>
-    </w:p>
-    <w:p>
-      <w:pPr>
-        <w:spacing w:before="40" w:after="40"/>
-        <w:pBdr>
-          <w:bottom w:val="single" w:sz="8" w:space="1" w:color="D4AF37"/>
-        </w:pBdr>
-      </w:pPr>
-    </w:p>
-    <w:p>
-      <w:pPr>
-        <w:spacing w:after="160"/>
-        <w:ind w:firstLine="0"/>
-        <w:jc w:val="both"/>
-      </w:pPr>
-      <w:r>
-        <w:rPr>
-          <w:rFonts w:ascii="Aptos" w:hAnsi="Aptos" w:cs="Aptos" w:eastAsia="Aptos"/>
-          <w:b w:val="0"/>
-          <w:i w:val="0"/>
-          <w:color w:val="444444"/>
-          <w:sz w:val="24"/>
-        </w:rPr>
-        <w:t>The application utilizes the Provider pattern for dependency injection and state updates.</w:t>
-      </w:r>
-    </w:p>
-    <w:p>
-      <w:pPr>
-        <w:spacing w:after="160"/>
-        <w:ind w:firstLine="0"/>
-        <w:jc w:val="both"/>
-      </w:pPr>
-      <w:r>
-        <w:rPr>
-          <w:rFonts w:ascii="Aptos" w:hAnsi="Aptos" w:cs="Aptos" w:eastAsia="Aptos"/>
-          <w:b w:val="0"/>
-          <w:i w:val="0"/>
-          <w:color w:val="444444"/>
-          <w:sz w:val="24"/>
-        </w:rPr>
-        <w:t>1. Read: context.read&lt;T&gt;() for one-time state access (e.g., inside methods).</w:t>
-      </w:r>
-    </w:p>
-    <w:p>
-      <w:pPr>
-        <w:spacing w:after="160"/>
-        <w:ind w:firstLine="0"/>
-        <w:jc w:val="both"/>
-      </w:pPr>
-      <w:r>
-        <w:rPr>
-          <w:rFonts w:ascii="Aptos" w:hAnsi="Aptos" w:cs="Aptos" w:eastAsia="Aptos"/>
-          <w:b w:val="0"/>
-          <w:i w:val="0"/>
-          <w:color w:val="444444"/>
-          <w:sz w:val="24"/>
-        </w:rPr>
-        <w:t>2. Watch: context.watch&lt;T&gt;() for UI-driven rebuilds.</w:t>
-      </w:r>
-    </w:p>
-    <w:p>
-      <w:pPr>
-        <w:spacing w:after="160"/>
-        <w:ind w:firstLine="0"/>
-        <w:jc w:val="both"/>
-      </w:pPr>
-      <w:r>
-        <w:rPr>
-          <w:rFonts w:ascii="Aptos" w:hAnsi="Aptos" w:cs="Aptos" w:eastAsia="Aptos"/>
-          <w:b w:val="0"/>
-          <w:i w:val="0"/>
-          <w:color w:val="444444"/>
-          <w:sz w:val="24"/>
-        </w:rPr>
-        <w:t>3. Select: context.select&lt;T, R&gt;() for granular subset observation.</w:t>
-      </w:r>
-    </w:p>
-    <w:p>
-      <w:pPr>
-        <w:spacing w:before="360" w:after="80"/>
-      </w:pPr>
-      <w:r>
-        <w:rPr>
-          <w:rFonts w:ascii="Aptos" w:hAnsi="Aptos" w:cs="Aptos" w:eastAsia="Aptos"/>
-          <w:b/>
-          <w:i w:val="0"/>
-          <w:color w:val="1A1A2E"/>
-          <w:sz w:val="40"/>
-        </w:rPr>
-        <w:t>7. Firebase &amp; Data Layer</w:t>
-      </w:r>
-    </w:p>
-    <w:p>
-      <w:pPr>
-        <w:spacing w:before="40" w:after="40"/>
-        <w:pBdr>
-          <w:bottom w:val="single" w:sz="8" w:space="1" w:color="D4AF37"/>
-        </w:pBdr>
-      </w:pPr>
-    </w:p>
-    <w:p>
-      <w:pPr>
-        <w:spacing w:after="160"/>
-        <w:ind w:firstLine="0"/>
-        <w:jc w:val="both"/>
-      </w:pPr>
-      <w:r>
-        <w:rPr>
-          <w:rFonts w:ascii="Aptos" w:hAnsi="Aptos" w:cs="Aptos" w:eastAsia="Aptos"/>
-          <w:b w:val="0"/>
-          <w:i w:val="0"/>
-          <w:color w:val="444444"/>
-          <w:sz w:val="24"/>
-        </w:rPr>
-        <w:t>The data layer is abstracted behind a service-provider pattern. The UI never interacts directly with Cloud Firestore; all requests pass through FirebaseService.</w:t>
-      </w:r>
-    </w:p>
-    <w:tbl>
-      <w:tblPr>
-        <w:tblStyle w:val="TableGrid"/>
-        <w:tblW w:type="auto" w:w="0"/>
-        <w:jc w:val="center"/>
-        <w:tblLook w:firstColumn="1" w:firstRow="1" w:lastColumn="0" w:lastRow="0" w:noHBand="0" w:noVBand="1" w:val="04A0"/>
-      </w:tblPr>
-      <w:tblGrid>
-        <w:gridCol w:w="3041"/>
-        <w:gridCol w:w="3041"/>
-        <w:gridCol w:w="3041"/>
-      </w:tblGrid>
-      <w:tr>
-        <w:tc>
-          <w:tcPr>
-            <w:tcW w:type="dxa" w:w="3041"/>
-            <w:shd w:val="clear" w:color="auto" w:fill="1A1A2E"/>
-          </w:tcPr>
-          <w:p>
-            <w:pPr>
-              <w:jc w:val="center"/>
-            </w:pPr>
-            <w:r>
-              <w:rPr>
-                <w:rFonts w:ascii="Aptos" w:hAnsi="Aptos" w:cs="Aptos" w:eastAsia="Aptos"/>
-                <w:b/>
-                <w:i w:val="0"/>
-                <w:color w:val="FFFFFF"/>
-                <w:sz w:val="22"/>
-              </w:rPr>
-              <w:t>Collection</w:t>
-            </w:r>
-          </w:p>
-        </w:tc>
-        <w:tc>
-          <w:tcPr>
-            <w:tcW w:type="dxa" w:w="3041"/>
-            <w:shd w:val="clear" w:color="auto" w:fill="1A1A2E"/>
-          </w:tcPr>
-          <w:p>
-            <w:pPr>
-              <w:jc w:val="center"/>
-            </w:pPr>
-            <w:r>
-              <w:rPr>
-                <w:rFonts w:ascii="Aptos" w:hAnsi="Aptos" w:cs="Aptos" w:eastAsia="Aptos"/>
-                <w:b/>
-                <w:i w:val="0"/>
-                <w:color w:val="FFFFFF"/>
-                <w:sz w:val="22"/>
-              </w:rPr>
-              <w:t>Purpose</w:t>
-            </w:r>
-          </w:p>
-        </w:tc>
-        <w:tc>
-          <w:tcPr>
-            <w:tcW w:type="dxa" w:w="3041"/>
-            <w:shd w:val="clear" w:color="auto" w:fill="1A1A2E"/>
-          </w:tcPr>
-          <w:p>
-            <w:pPr>
-              <w:jc w:val="center"/>
-            </w:pPr>
-            <w:r>
-              <w:rPr>
-                <w:rFonts w:ascii="Aptos" w:hAnsi="Aptos" w:cs="Aptos" w:eastAsia="Aptos"/>
-                <w:b/>
-                <w:i w:val="0"/>
-                <w:color w:val="FFFFFF"/>
-                <w:sz w:val="22"/>
-              </w:rPr>
-              <w:t>Access Level</w:t>
-            </w:r>
-          </w:p>
-        </w:tc>
-      </w:tr>
-      <w:tr>
-        <w:tc>
-          <w:tcPr>
-            <w:tcW w:type="dxa" w:w="3041"/>
-            <w:shd w:val="clear" w:color="auto" w:fill="F5F5F5"/>
-          </w:tcPr>
-          <w:p>
-            <w:r>
-              <w:rPr>
-                <w:rFonts w:ascii="Aptos" w:hAnsi="Aptos" w:cs="Aptos" w:eastAsia="Aptos"/>
-                <w:b w:val="0"/>
-                <w:i w:val="0"/>
-                <w:color w:val="444444"/>
-                <w:sz w:val="20"/>
-              </w:rPr>
-              <w:t>/products/</w:t>
-            </w:r>
-          </w:p>
-        </w:tc>
-        <w:tc>
-          <w:tcPr>
-            <w:tcW w:type="dxa" w:w="3041"/>
-            <w:shd w:val="clear" w:color="auto" w:fill="F5F5F5"/>
-          </w:tcPr>
-          <w:p>
-            <w:r>
-              <w:rPr>
-                <w:rFonts w:ascii="Aptos" w:hAnsi="Aptos" w:cs="Aptos" w:eastAsia="Aptos"/>
-                <w:b w:val="0"/>
-                <w:i w:val="0"/>
-                <w:color w:val="444444"/>
-                <w:sz w:val="20"/>
-              </w:rPr>
-              <w:t>Live Catalog</w:t>
-            </w:r>
-          </w:p>
-        </w:tc>
-        <w:tc>
-          <w:tcPr>
-            <w:tcW w:type="dxa" w:w="3041"/>
-            <w:shd w:val="clear" w:color="auto" w:fill="F5F5F5"/>
-          </w:tcPr>
-          <w:p>
-            <w:r>
-              <w:rPr>
-                <w:rFonts w:ascii="Aptos" w:hAnsi="Aptos" w:cs="Aptos" w:eastAsia="Aptos"/>
-                <w:b w:val="0"/>
-                <w:i w:val="0"/>
-                <w:color w:val="444444"/>
-                <w:sz w:val="20"/>
-              </w:rPr>
-              <w:t>Auth-Read / Admin-Write</w:t>
-            </w:r>
-          </w:p>
-        </w:tc>
-      </w:tr>
-      <w:tr>
-        <w:tc>
-          <w:tcPr>
-            <w:tcW w:type="dxa" w:w="3041"/>
-            <w:shd w:val="clear" w:color="auto" w:fill="FFFFFF"/>
-          </w:tcPr>
-          <w:p>
-            <w:r>
-              <w:rPr>
-                <w:rFonts w:ascii="Aptos" w:hAnsi="Aptos" w:cs="Aptos" w:eastAsia="Aptos"/>
-                <w:b w:val="0"/>
-                <w:i w:val="0"/>
-                <w:color w:val="444444"/>
-                <w:sz w:val="20"/>
-              </w:rPr>
-              <w:t>/users/</w:t>
-            </w:r>
-          </w:p>
-        </w:tc>
-        <w:tc>
-          <w:tcPr>
-            <w:tcW w:type="dxa" w:w="3041"/>
-            <w:shd w:val="clear" w:color="auto" w:fill="FFFFFF"/>
-          </w:tcPr>
-          <w:p>
-            <w:r>
-              <w:rPr>
-                <w:rFonts w:ascii="Aptos" w:hAnsi="Aptos" w:cs="Aptos" w:eastAsia="Aptos"/>
-                <w:b w:val="0"/>
-                <w:i w:val="0"/>
-                <w:color w:val="444444"/>
-                <w:sz w:val="20"/>
-              </w:rPr>
-              <w:t>User Profiles</w:t>
-            </w:r>
-          </w:p>
-        </w:tc>
-        <w:tc>
-          <w:tcPr>
-            <w:tcW w:type="dxa" w:w="3041"/>
-            <w:shd w:val="clear" w:color="auto" w:fill="FFFFFF"/>
-          </w:tcPr>
-          <w:p>
-            <w:r>
-              <w:rPr>
-                <w:rFonts w:ascii="Aptos" w:hAnsi="Aptos" w:cs="Aptos" w:eastAsia="Aptos"/>
-                <w:b w:val="0"/>
-                <w:i w:val="0"/>
-                <w:color w:val="444444"/>
-                <w:sz w:val="20"/>
-              </w:rPr>
-              <w:t>Owner-Read/Write</w:t>
-            </w:r>
-          </w:p>
-        </w:tc>
-      </w:tr>
-      <w:tr>
-        <w:tc>
-          <w:tcPr>
-            <w:tcW w:type="dxa" w:w="3041"/>
-            <w:shd w:val="clear" w:color="auto" w:fill="F5F5F5"/>
-          </w:tcPr>
-          <w:p>
-            <w:r>
-              <w:rPr>
-                <w:rFonts w:ascii="Aptos" w:hAnsi="Aptos" w:cs="Aptos" w:eastAsia="Aptos"/>
-                <w:b w:val="0"/>
-                <w:i w:val="0"/>
-                <w:color w:val="444444"/>
-                <w:sz w:val="20"/>
-              </w:rPr>
-              <w:t>/staging/</w:t>
-            </w:r>
-          </w:p>
-        </w:tc>
-        <w:tc>
-          <w:tcPr>
-            <w:tcW w:type="dxa" w:w="3041"/>
-            <w:shd w:val="clear" w:color="auto" w:fill="F5F5F5"/>
-          </w:tcPr>
-          <w:p>
-            <w:r>
-              <w:rPr>
-                <w:rFonts w:ascii="Aptos" w:hAnsi="Aptos" w:cs="Aptos" w:eastAsia="Aptos"/>
-                <w:b w:val="0"/>
-                <w:i w:val="0"/>
-                <w:color w:val="444444"/>
-                <w:sz w:val="20"/>
-              </w:rPr>
-              <w:t>Draft changes</w:t>
-            </w:r>
-          </w:p>
-        </w:tc>
-        <w:tc>
-          <w:tcPr>
-            <w:tcW w:type="dxa" w:w="3041"/>
-            <w:shd w:val="clear" w:color="auto" w:fill="F5F5F5"/>
-          </w:tcPr>
-          <w:p>
-            <w:r>
-              <w:rPr>
-                <w:rFonts w:ascii="Aptos" w:hAnsi="Aptos" w:cs="Aptos" w:eastAsia="Aptos"/>
-                <w:b w:val="0"/>
-                <w:i w:val="0"/>
-                <w:color w:val="444444"/>
-                <w:sz w:val="20"/>
-              </w:rPr>
-              <w:t>Admin-Only</w:t>
-            </w:r>
-          </w:p>
-        </w:tc>
-      </w:tr>
-    </w:tbl>
-    <w:p/>
-    <w:p>
-      <w:pPr>
-        <w:spacing w:before="360" w:after="80"/>
-      </w:pPr>
-      <w:r>
-        <w:rPr>
-          <w:rFonts w:ascii="Aptos" w:hAnsi="Aptos" w:cs="Aptos" w:eastAsia="Aptos"/>
-          <w:b/>
-          <w:i w:val="0"/>
-          <w:color w:val="1A1A2E"/>
-          <w:sz w:val="40"/>
-        </w:rPr>
-        <w:t>8. Security Practices</w:t>
-      </w:r>
-    </w:p>
-    <w:p>
-      <w:pPr>
-        <w:spacing w:before="40" w:after="40"/>
-        <w:pBdr>
-          <w:bottom w:val="single" w:sz="8" w:space="1" w:color="D4AF37"/>
-        </w:pBdr>
-      </w:pPr>
-    </w:p>
-    <w:p>
-      <w:pPr>
-        <w:spacing w:before="120" w:after="120"/>
-        <w:jc w:val="both"/>
-      </w:pPr>
-      <w:r>
-        <w:rPr>
-          <w:rFonts w:ascii="Aptos" w:hAnsi="Aptos" w:cs="Aptos" w:eastAsia="Aptos"/>
-          <w:b/>
-          <w:i w:val="0"/>
-          <w:color w:val="D4AF37"/>
-          <w:sz w:val="24"/>
-        </w:rPr>
-        <w:t xml:space="preserve">MANDATORY: </w:t>
-      </w:r>
-      <w:r>
-        <w:rPr>
-          <w:rFonts w:ascii="Aptos" w:hAnsi="Aptos" w:cs="Aptos" w:eastAsia="Aptos"/>
-          <w:b w:val="0"/>
-          <w:i w:val="0"/>
-          <w:color w:val="444444"/>
-          <w:sz w:val="24"/>
-        </w:rPr>
-        <w:t>PII fields (Name, Phone, Role) must NEVER be stored in plaintext SharedPreferences. Always use SecureLocalStorageService.</w:t>
-      </w:r>
-    </w:p>
-    <w:p>
-      <w:pPr>
-        <w:spacing w:after="160"/>
-        <w:ind w:firstLine="0"/>
-        <w:jc w:val="both"/>
-      </w:pPr>
-      <w:r>
-        <w:rPr>
-          <w:rFonts w:ascii="Aptos" w:hAnsi="Aptos" w:cs="Aptos" w:eastAsia="Aptos"/>
-          <w:b w:val="0"/>
-          <w:i w:val="0"/>
-          <w:color w:val="444444"/>
-          <w:sz w:val="24"/>
-        </w:rPr>
-        <w:t>1. Secure Storage: All identifying fields encrypted at rest.</w:t>
-      </w:r>
-    </w:p>
-    <w:p>
-      <w:pPr>
-        <w:spacing w:after="160"/>
-        <w:ind w:firstLine="0"/>
-        <w:jc w:val="both"/>
-      </w:pPr>
-      <w:r>
-        <w:rPr>
-          <w:rFonts w:ascii="Aptos" w:hAnsi="Aptos" w:cs="Aptos" w:eastAsia="Aptos"/>
-          <w:b w:val="0"/>
-          <w:i w:val="0"/>
-          <w:color w:val="444444"/>
-          <w:sz w:val="24"/>
-        </w:rPr>
-        <w:t>2. Rate Limiting: 60s client-side cooldown on sensitive OTP actions.</w:t>
-      </w:r>
-    </w:p>
-    <w:p>
-      <w:pPr>
-        <w:spacing w:after="160"/>
-        <w:ind w:firstLine="0"/>
-        <w:jc w:val="both"/>
-      </w:pPr>
-      <w:r>
-        <w:rPr>
-          <w:rFonts w:ascii="Aptos" w:hAnsi="Aptos" w:cs="Aptos" w:eastAsia="Aptos"/>
-          <w:b w:val="0"/>
-          <w:i w:val="0"/>
-          <w:color w:val="444444"/>
-          <w:sz w:val="24"/>
-        </w:rPr>
-        <w:t>3. Validation: Server-side Firestore rules enforce role-based access control.</w:t>
-      </w:r>
-    </w:p>
-    <w:p>
-      <w:pPr>
-        <w:spacing w:before="360" w:after="80"/>
-      </w:pPr>
-      <w:r>
-        <w:rPr>
-          <w:rFonts w:ascii="Aptos" w:hAnsi="Aptos" w:cs="Aptos" w:eastAsia="Aptos"/>
-          <w:b/>
-          <w:i w:val="0"/>
-          <w:color w:val="1A1A2E"/>
-          <w:sz w:val="40"/>
-        </w:rPr>
-        <w:t>9. Build &amp; Deployment</w:t>
-      </w:r>
-    </w:p>
-    <w:p>
-      <w:pPr>
-        <w:spacing w:before="40" w:after="40"/>
-        <w:pBdr>
-          <w:bottom w:val="single" w:sz="8" w:space="1" w:color="D4AF37"/>
-        </w:pBdr>
-      </w:pPr>
-    </w:p>
-    <w:p>
-      <w:pPr>
-        <w:spacing w:after="160"/>
-        <w:ind w:firstLine="0"/>
-        <w:jc w:val="both"/>
-      </w:pPr>
-      <w:r>
-        <w:rPr>
-          <w:rFonts w:ascii="Aptos" w:hAnsi="Aptos" w:cs="Aptos" w:eastAsia="Aptos"/>
-          <w:b w:val="0"/>
-          <w:i w:val="0"/>
-          <w:color w:val="444444"/>
-          <w:sz w:val="24"/>
-        </w:rPr>
-        <w:t>Deployment requires a clean build and full environment check.</w:t>
-      </w:r>
-    </w:p>
-    <w:p>
-      <w:pPr>
-        <w:spacing w:after="160"/>
-        <w:ind w:firstLine="0"/>
-        <w:jc w:val="both"/>
-      </w:pPr>
-      <w:r>
-        <w:rPr>
-          <w:rFonts w:ascii="Aptos" w:hAnsi="Aptos" w:cs="Aptos" w:eastAsia="Aptos"/>
-          <w:b w:val="0"/>
-          <w:i w:val="0"/>
-          <w:color w:val="444444"/>
-          <w:sz w:val="24"/>
-        </w:rPr>
-        <w:t>Build APK: flutter build apk --release</w:t>
-      </w:r>
-    </w:p>
-    <w:p>
-      <w:pPr>
-        <w:spacing w:after="160"/>
-        <w:ind w:firstLine="0"/>
-        <w:jc w:val="both"/>
-      </w:pPr>
-      <w:r>
-        <w:rPr>
-          <w:rFonts w:ascii="Aptos" w:hAnsi="Aptos" w:cs="Aptos" w:eastAsia="Aptos"/>
-          <w:b w:val="0"/>
-          <w:i w:val="0"/>
-          <w:color w:val="444444"/>
-          <w:sz w:val="24"/>
-        </w:rPr>
-        <w:t>Build AppBundle: flutter build appbundle --release</w:t>
-      </w:r>
-    </w:p>
-    <w:p>
-      <w:pPr>
-        <w:spacing w:before="360" w:after="80"/>
-      </w:pPr>
-      <w:r>
-        <w:rPr>
-          <w:rFonts w:ascii="Aptos" w:hAnsi="Aptos" w:cs="Aptos" w:eastAsia="Aptos"/>
-          <w:b/>
-          <w:i w:val="0"/>
-          <w:color w:val="1A1A2E"/>
-          <w:sz w:val="40"/>
-        </w:rPr>
-        <w:t>10. Testing Workflow</w:t>
-      </w:r>
-    </w:p>
-    <w:p>
-      <w:pPr>
-        <w:spacing w:before="40" w:after="40"/>
-        <w:pBdr>
-          <w:bottom w:val="single" w:sz="8" w:space="1" w:color="D4AF37"/>
-        </w:pBdr>
-      </w:pPr>
-    </w:p>
-    <w:p>
-      <w:pPr>
-        <w:spacing w:after="160"/>
-        <w:ind w:firstLine="0"/>
-        <w:jc w:val="both"/>
-      </w:pPr>
-      <w:r>
-        <w:rPr>
-          <w:rFonts w:ascii="Aptos" w:hAnsi="Aptos" w:cs="Aptos" w:eastAsia="Aptos"/>
-          <w:b w:val="0"/>
-          <w:i w:val="0"/>
-          <w:color w:val="444444"/>
-          <w:sz w:val="24"/>
-        </w:rPr>
-        <w:t>A manual and automated testing suite must be executed prior to any release. Manual tests are documented in the QA Test Cases report. Automated tests live in the test/ directory.</w:t>
+        <w:t>Logging: Use debugPrint() for dev logs; wrapped in kDebugMode check.</w:t>
       </w:r>
     </w:p>
     <w:sectPr>

</xml_diff>